<commit_message>
docs: redesign report cover and refine layout
</commit_message>
<xml_diff>
--- a/docs/202380010733-钱锐-软件工程实验一.docx
+++ b/docs/202380010733-钱锐-软件工程实验一.docx
@@ -4,222 +4,691 @@
   <w:body>
     <w:p>
       <w:pPr>
-        <w:spacing w:before="1872" w:beforeLines="600" w:after="312" w:afterLines="100" w:line="480" w:lineRule="auto"/>
+        <w:keepNext/>
+        <w:spacing w:before="920" w:after="0" w:line="240" w:lineRule="auto"/>
+        <w:ind w:left="0" w:right="0" w:firstLine="0"/>
         <w:jc w:val="center"/>
-        <w:outlineLvl w:val="9"/>
-        <w:rPr>
-          <w:rFonts w:ascii="楷体_GB2312" w:eastAsia="楷体_GB2312"/>
+      </w:pPr>
+      <w:r>
+        <w:rPr>
+          <w:rFonts w:hint="eastAsia" w:ascii="Aptos" w:eastAsia="Microsoft YaHei" w:hAnsi="Aptos"/>
+          <w:b w:val="0"/>
+          <w:bCs/>
+          <w:color w:val="486581"/>
+          <w:sz w:val="26"/>
+        </w:rPr>
+        <w:t>三峡大学 · 计算机与信息学院</w:t>
+      </w:r>
+    </w:p>
+    <w:p>
+      <w:pPr>
+        <w:keepNext/>
+        <w:spacing w:before="1220" w:after="200" w:line="240" w:lineRule="auto"/>
+        <w:ind w:left="0" w:right="0" w:firstLine="0"/>
+        <w:jc w:val="center"/>
+      </w:pPr>
+      <w:r>
+        <w:rPr>
+          <w:rFonts w:hint="eastAsia" w:ascii="Aptos" w:eastAsia="Microsoft YaHei" w:hAnsi="Aptos"/>
+          <w:b w:val="0"/>
+          <w:bCs/>
+          <w:color w:val="17365D"/>
+          <w:sz w:val="54"/>
+          <w:szCs w:val="22"/>
+        </w:rPr>
+        <w:t>个人编程技能与 Git 操作</w:t>
+      </w:r>
+    </w:p>
+    <w:p>
+      <w:pPr>
+        <w:keepNext/>
+        <w:spacing w:before="0" w:after="180" w:line="240" w:lineRule="auto"/>
+        <w:jc w:val="center"/>
+      </w:pPr>
+      <w:r>
+        <w:rPr>
+          <w:rFonts w:ascii="Aptos" w:hAnsi="Aptos" w:eastAsia="Microsoft YaHei"/>
           <w:b/>
-          <w:bCs/>
-          <w:sz w:val="52"/>
-        </w:rPr>
-      </w:pPr>
-      <w:r>
-        <w:rPr>
-          <w:rFonts w:hint="eastAsia" w:ascii="楷体_GB2312" w:eastAsia="楷体_GB2312"/>
+          <w:color w:val="2C7A7B"/>
+          <w:sz w:val="24"/>
+        </w:rPr>
+        <w:t>软件工程实验一  ·  课程实验报告</w:t>
+      </w:r>
+    </w:p>
+    <w:p>
+      <w:pPr>
+        <w:keepNext/>
+        <w:spacing w:before="0" w:after="0" w:line="240" w:lineRule="auto"/>
+        <w:jc w:val="center"/>
+      </w:pPr>
+      <w:r>
+        <w:rPr>
+          <w:rFonts w:ascii="Aptos" w:hAnsi="Aptos" w:eastAsia="Microsoft YaHei"/>
+          <w:b w:val="0"/>
+          <w:color w:val="486581"/>
+          <w:sz w:val="28"/>
+        </w:rPr>
+        <w:t>HJ212-2017 报文解析器设计与验证</w:t>
+      </w:r>
+    </w:p>
+    <w:p>
+      <w:pPr>
+        <w:spacing w:before="980" w:after="0"/>
+      </w:pPr>
+    </w:p>
+    <w:tbl>
+      <w:tblPr>
+        <w:tblStyle w:val="9"/>
+        <w:tblW w:type="auto" w:w="0"/>
+        <w:jc w:val="center"/>
+        <w:tblLayout w:type="fixed"/>
+        <w:tblLook w:firstColumn="1" w:firstRow="1" w:lastColumn="0" w:lastRow="0" w:noHBand="0" w:noVBand="1" w:val="04A0"/>
+      </w:tblPr>
+      <w:tblGrid>
+        <w:gridCol w:w="2076"/>
+        <w:gridCol w:w="2076"/>
+        <w:gridCol w:w="2076"/>
+        <w:gridCol w:w="2076"/>
+      </w:tblGrid>
+      <w:tr>
+        <w:trPr>
+          <w:cantSplit/>
+        </w:trPr>
+        <w:tc>
+          <w:tcPr>
+            <w:tcW w:type="dxa" w:w="1181"/>
+            <w:vAlign w:val="center"/>
+            <w:tcMar>
+              <w:top w:w="115" w:type="dxa"/>
+              <w:bottom w:w="115" w:type="dxa"/>
+              <w:left w:w="115" w:type="dxa"/>
+              <w:right w:w="115" w:type="dxa"/>
+            </w:tcMar>
+            <w:tcBorders>
+              <w:top w:val="single" w:sz="5" w:color="D6E0EA"/>
+              <w:left w:val="single" w:sz="5" w:color="D6E0EA"/>
+              <w:bottom w:val="single" w:sz="5" w:color="D6E0EA"/>
+              <w:right w:val="single" w:sz="5" w:color="D6E0EA"/>
+              <w:insideH w:val="single" w:sz="5" w:color="D6E0EA"/>
+              <w:insideV w:val="single" w:sz="5" w:color="D6E0EA"/>
+            </w:tcBorders>
+            <w:shd w:fill="EAF1F7"/>
+          </w:tcPr>
+          <w:p>
+            <w:pPr>
+              <w:spacing w:before="0" w:after="0" w:line="240" w:lineRule="auto"/>
+              <w:jc w:val="center"/>
+            </w:pPr>
+            <w:r>
+              <w:rPr>
+                <w:rFonts w:ascii="Aptos" w:hAnsi="Aptos" w:eastAsia="Microsoft YaHei"/>
+                <w:b/>
+                <w:color w:val="243B53"/>
+                <w:sz w:val="21"/>
+              </w:rPr>
+              <w:t>姓  名</w:t>
+            </w:r>
+          </w:p>
+        </w:tc>
+        <w:tc>
+          <w:tcPr>
+            <w:tcW w:type="dxa" w:w="2851"/>
+            <w:vAlign w:val="center"/>
+            <w:tcMar>
+              <w:top w:w="115" w:type="dxa"/>
+              <w:bottom w:w="115" w:type="dxa"/>
+              <w:left w:w="115" w:type="dxa"/>
+              <w:right w:w="115" w:type="dxa"/>
+            </w:tcMar>
+            <w:tcBorders>
+              <w:top w:val="single" w:sz="5" w:color="D6E0EA"/>
+              <w:left w:val="single" w:sz="5" w:color="D6E0EA"/>
+              <w:bottom w:val="single" w:sz="5" w:color="D6E0EA"/>
+              <w:right w:val="single" w:sz="5" w:color="D6E0EA"/>
+              <w:insideH w:val="single" w:sz="5" w:color="D6E0EA"/>
+              <w:insideV w:val="single" w:sz="5" w:color="D6E0EA"/>
+            </w:tcBorders>
+          </w:tcPr>
+          <w:p>
+            <w:pPr>
+              <w:spacing w:before="0" w:after="0" w:line="240" w:lineRule="auto"/>
+              <w:jc w:val="center"/>
+            </w:pPr>
+            <w:r>
+              <w:rPr>
+                <w:rFonts w:ascii="Aptos" w:hAnsi="Aptos" w:eastAsia="Microsoft YaHei"/>
+                <w:color w:val="243B53"/>
+                <w:sz w:val="21"/>
+              </w:rPr>
+              <w:t>钱锐</w:t>
+            </w:r>
+          </w:p>
+        </w:tc>
+        <w:tc>
+          <w:tcPr>
+            <w:tcW w:type="dxa" w:w="1181"/>
+            <w:vAlign w:val="center"/>
+            <w:tcMar>
+              <w:top w:w="115" w:type="dxa"/>
+              <w:bottom w:w="115" w:type="dxa"/>
+              <w:left w:w="115" w:type="dxa"/>
+              <w:right w:w="115" w:type="dxa"/>
+            </w:tcMar>
+            <w:tcBorders>
+              <w:top w:val="single" w:sz="5" w:color="D6E0EA"/>
+              <w:left w:val="single" w:sz="5" w:color="D6E0EA"/>
+              <w:bottom w:val="single" w:sz="5" w:color="D6E0EA"/>
+              <w:right w:val="single" w:sz="5" w:color="D6E0EA"/>
+              <w:insideH w:val="single" w:sz="5" w:color="D6E0EA"/>
+              <w:insideV w:val="single" w:sz="5" w:color="D6E0EA"/>
+            </w:tcBorders>
+            <w:shd w:fill="EAF1F7"/>
+          </w:tcPr>
+          <w:p>
+            <w:pPr>
+              <w:spacing w:before="0" w:after="0" w:line="240" w:lineRule="auto"/>
+              <w:jc w:val="center"/>
+            </w:pPr>
+            <w:r>
+              <w:rPr>
+                <w:rFonts w:ascii="Aptos" w:hAnsi="Aptos" w:eastAsia="Microsoft YaHei"/>
+                <w:b/>
+                <w:color w:val="243B53"/>
+                <w:sz w:val="21"/>
+              </w:rPr>
+              <w:t>学  号</w:t>
+            </w:r>
+          </w:p>
+        </w:tc>
+        <w:tc>
+          <w:tcPr>
+            <w:tcW w:type="dxa" w:w="3096"/>
+            <w:vAlign w:val="center"/>
+            <w:tcMar>
+              <w:top w:w="115" w:type="dxa"/>
+              <w:bottom w:w="115" w:type="dxa"/>
+              <w:left w:w="115" w:type="dxa"/>
+              <w:right w:w="115" w:type="dxa"/>
+            </w:tcMar>
+            <w:tcBorders>
+              <w:top w:val="single" w:sz="5" w:color="D6E0EA"/>
+              <w:left w:val="single" w:sz="5" w:color="D6E0EA"/>
+              <w:bottom w:val="single" w:sz="5" w:color="D6E0EA"/>
+              <w:right w:val="single" w:sz="5" w:color="D6E0EA"/>
+              <w:insideH w:val="single" w:sz="5" w:color="D6E0EA"/>
+              <w:insideV w:val="single" w:sz="5" w:color="D6E0EA"/>
+            </w:tcBorders>
+          </w:tcPr>
+          <w:p>
+            <w:pPr>
+              <w:spacing w:before="0" w:after="0" w:line="240" w:lineRule="auto"/>
+              <w:jc w:val="center"/>
+            </w:pPr>
+            <w:r>
+              <w:rPr>
+                <w:rFonts w:ascii="Aptos" w:hAnsi="Aptos" w:eastAsia="Microsoft YaHei"/>
+                <w:color w:val="243B53"/>
+                <w:sz w:val="21"/>
+              </w:rPr>
+              <w:t>202380010733</w:t>
+            </w:r>
+          </w:p>
+        </w:tc>
+      </w:tr>
+      <w:tr>
+        <w:trPr>
+          <w:cantSplit/>
+        </w:trPr>
+        <w:tc>
+          <w:tcPr>
+            <w:tcW w:type="dxa" w:w="1181"/>
+            <w:vAlign w:val="center"/>
+            <w:tcMar>
+              <w:top w:w="115" w:type="dxa"/>
+              <w:bottom w:w="115" w:type="dxa"/>
+              <w:left w:w="115" w:type="dxa"/>
+              <w:right w:w="115" w:type="dxa"/>
+            </w:tcMar>
+            <w:tcBorders>
+              <w:top w:val="single" w:sz="5" w:color="D6E0EA"/>
+              <w:left w:val="single" w:sz="5" w:color="D6E0EA"/>
+              <w:bottom w:val="single" w:sz="5" w:color="D6E0EA"/>
+              <w:right w:val="single" w:sz="5" w:color="D6E0EA"/>
+              <w:insideH w:val="single" w:sz="5" w:color="D6E0EA"/>
+              <w:insideV w:val="single" w:sz="5" w:color="D6E0EA"/>
+            </w:tcBorders>
+            <w:shd w:fill="EAF1F7"/>
+          </w:tcPr>
+          <w:p>
+            <w:pPr>
+              <w:spacing w:before="0" w:after="0" w:line="240" w:lineRule="auto"/>
+              <w:jc w:val="center"/>
+            </w:pPr>
+            <w:r>
+              <w:rPr>
+                <w:rFonts w:ascii="Aptos" w:hAnsi="Aptos" w:eastAsia="Microsoft YaHei"/>
+                <w:b/>
+                <w:color w:val="243B53"/>
+                <w:sz w:val="21"/>
+              </w:rPr>
+              <w:t>院  系</w:t>
+            </w:r>
+          </w:p>
+        </w:tc>
+        <w:tc>
+          <w:tcPr>
+            <w:tcW w:type="dxa" w:w="2851"/>
+            <w:vAlign w:val="center"/>
+            <w:tcMar>
+              <w:top w:w="115" w:type="dxa"/>
+              <w:bottom w:w="115" w:type="dxa"/>
+              <w:left w:w="115" w:type="dxa"/>
+              <w:right w:w="115" w:type="dxa"/>
+            </w:tcMar>
+            <w:tcBorders>
+              <w:top w:val="single" w:sz="5" w:color="D6E0EA"/>
+              <w:left w:val="single" w:sz="5" w:color="D6E0EA"/>
+              <w:bottom w:val="single" w:sz="5" w:color="D6E0EA"/>
+              <w:right w:val="single" w:sz="5" w:color="D6E0EA"/>
+              <w:insideH w:val="single" w:sz="5" w:color="D6E0EA"/>
+              <w:insideV w:val="single" w:sz="5" w:color="D6E0EA"/>
+            </w:tcBorders>
+          </w:tcPr>
+          <w:p>
+            <w:pPr>
+              <w:spacing w:before="0" w:after="0" w:line="240" w:lineRule="auto"/>
+              <w:jc w:val="center"/>
+            </w:pPr>
+            <w:r>
+              <w:rPr>
+                <w:rFonts w:ascii="Aptos" w:hAnsi="Aptos" w:eastAsia="Microsoft YaHei"/>
+                <w:color w:val="243B53"/>
+                <w:sz w:val="21"/>
+              </w:rPr>
+              <w:t>计算机与信息学院</w:t>
+            </w:r>
+          </w:p>
+        </w:tc>
+        <w:tc>
+          <w:tcPr>
+            <w:tcW w:type="dxa" w:w="1181"/>
+            <w:vAlign w:val="center"/>
+            <w:tcMar>
+              <w:top w:w="115" w:type="dxa"/>
+              <w:bottom w:w="115" w:type="dxa"/>
+              <w:left w:w="115" w:type="dxa"/>
+              <w:right w:w="115" w:type="dxa"/>
+            </w:tcMar>
+            <w:tcBorders>
+              <w:top w:val="single" w:sz="5" w:color="D6E0EA"/>
+              <w:left w:val="single" w:sz="5" w:color="D6E0EA"/>
+              <w:bottom w:val="single" w:sz="5" w:color="D6E0EA"/>
+              <w:right w:val="single" w:sz="5" w:color="D6E0EA"/>
+              <w:insideH w:val="single" w:sz="5" w:color="D6E0EA"/>
+              <w:insideV w:val="single" w:sz="5" w:color="D6E0EA"/>
+            </w:tcBorders>
+            <w:shd w:fill="EAF1F7"/>
+          </w:tcPr>
+          <w:p>
+            <w:pPr>
+              <w:spacing w:before="0" w:after="0" w:line="240" w:lineRule="auto"/>
+              <w:jc w:val="center"/>
+            </w:pPr>
+            <w:r>
+              <w:rPr>
+                <w:rFonts w:ascii="Aptos" w:hAnsi="Aptos" w:eastAsia="Microsoft YaHei"/>
+                <w:b/>
+                <w:color w:val="243B53"/>
+                <w:sz w:val="21"/>
+              </w:rPr>
+              <w:t>专  业</w:t>
+            </w:r>
+          </w:p>
+        </w:tc>
+        <w:tc>
+          <w:tcPr>
+            <w:tcW w:type="dxa" w:w="3096"/>
+            <w:vAlign w:val="center"/>
+            <w:tcMar>
+              <w:top w:w="115" w:type="dxa"/>
+              <w:bottom w:w="115" w:type="dxa"/>
+              <w:left w:w="115" w:type="dxa"/>
+              <w:right w:w="115" w:type="dxa"/>
+            </w:tcMar>
+            <w:tcBorders>
+              <w:top w:val="single" w:sz="5" w:color="D6E0EA"/>
+              <w:left w:val="single" w:sz="5" w:color="D6E0EA"/>
+              <w:bottom w:val="single" w:sz="5" w:color="D6E0EA"/>
+              <w:right w:val="single" w:sz="5" w:color="D6E0EA"/>
+              <w:insideH w:val="single" w:sz="5" w:color="D6E0EA"/>
+              <w:insideV w:val="single" w:sz="5" w:color="D6E0EA"/>
+            </w:tcBorders>
+          </w:tcPr>
+          <w:p>
+            <w:pPr>
+              <w:spacing w:before="0" w:after="0" w:line="240" w:lineRule="auto"/>
+              <w:jc w:val="center"/>
+            </w:pPr>
+            <w:r>
+              <w:rPr>
+                <w:rFonts w:ascii="Aptos" w:hAnsi="Aptos" w:eastAsia="Microsoft YaHei"/>
+                <w:color w:val="243B53"/>
+                <w:sz w:val="21"/>
+              </w:rPr>
+              <w:t>计算机科学与技术</w:t>
+            </w:r>
+          </w:p>
+        </w:tc>
+      </w:tr>
+      <w:tr>
+        <w:trPr>
+          <w:cantSplit/>
+        </w:trPr>
+        <w:tc>
+          <w:tcPr>
+            <w:tcW w:type="dxa" w:w="1181"/>
+            <w:vAlign w:val="center"/>
+            <w:tcMar>
+              <w:top w:w="115" w:type="dxa"/>
+              <w:bottom w:w="115" w:type="dxa"/>
+              <w:left w:w="115" w:type="dxa"/>
+              <w:right w:w="115" w:type="dxa"/>
+            </w:tcMar>
+            <w:tcBorders>
+              <w:top w:val="single" w:sz="5" w:color="D6E0EA"/>
+              <w:left w:val="single" w:sz="5" w:color="D6E0EA"/>
+              <w:bottom w:val="single" w:sz="5" w:color="D6E0EA"/>
+              <w:right w:val="single" w:sz="5" w:color="D6E0EA"/>
+              <w:insideH w:val="single" w:sz="5" w:color="D6E0EA"/>
+              <w:insideV w:val="single" w:sz="5" w:color="D6E0EA"/>
+            </w:tcBorders>
+            <w:shd w:fill="EAF1F7"/>
+          </w:tcPr>
+          <w:p>
+            <w:pPr>
+              <w:spacing w:before="0" w:after="0" w:line="240" w:lineRule="auto"/>
+              <w:jc w:val="center"/>
+            </w:pPr>
+            <w:r>
+              <w:rPr>
+                <w:rFonts w:ascii="Aptos" w:hAnsi="Aptos" w:eastAsia="Microsoft YaHei"/>
+                <w:b/>
+                <w:color w:val="243B53"/>
+                <w:sz w:val="21"/>
+              </w:rPr>
+              <w:t>实验室</w:t>
+            </w:r>
+          </w:p>
+        </w:tc>
+        <w:tc>
+          <w:tcPr>
+            <w:tcW w:type="dxa" w:w="2851"/>
+            <w:vAlign w:val="center"/>
+            <w:tcMar>
+              <w:top w:w="115" w:type="dxa"/>
+              <w:bottom w:w="115" w:type="dxa"/>
+              <w:left w:w="115" w:type="dxa"/>
+              <w:right w:w="115" w:type="dxa"/>
+            </w:tcMar>
+            <w:tcBorders>
+              <w:top w:val="single" w:sz="5" w:color="D6E0EA"/>
+              <w:left w:val="single" w:sz="5" w:color="D6E0EA"/>
+              <w:bottom w:val="single" w:sz="5" w:color="D6E0EA"/>
+              <w:right w:val="single" w:sz="5" w:color="D6E0EA"/>
+              <w:insideH w:val="single" w:sz="5" w:color="D6E0EA"/>
+              <w:insideV w:val="single" w:sz="5" w:color="D6E0EA"/>
+            </w:tcBorders>
+          </w:tcPr>
+          <w:p>
+            <w:pPr>
+              <w:spacing w:before="0" w:after="0" w:line="240" w:lineRule="auto"/>
+              <w:jc w:val="center"/>
+            </w:pPr>
+            <w:r>
+              <w:rPr>
+                <w:rFonts w:ascii="Aptos" w:hAnsi="Aptos" w:eastAsia="Microsoft YaHei"/>
+                <w:color w:val="243B53"/>
+                <w:sz w:val="21"/>
+              </w:rPr>
+            </w:r>
+          </w:p>
+        </w:tc>
+        <w:tc>
+          <w:tcPr>
+            <w:tcW w:type="dxa" w:w="1181"/>
+            <w:vAlign w:val="center"/>
+            <w:tcMar>
+              <w:top w:w="115" w:type="dxa"/>
+              <w:bottom w:w="115" w:type="dxa"/>
+              <w:left w:w="115" w:type="dxa"/>
+              <w:right w:w="115" w:type="dxa"/>
+            </w:tcMar>
+            <w:tcBorders>
+              <w:top w:val="single" w:sz="5" w:color="D6E0EA"/>
+              <w:left w:val="single" w:sz="5" w:color="D6E0EA"/>
+              <w:bottom w:val="single" w:sz="5" w:color="D6E0EA"/>
+              <w:right w:val="single" w:sz="5" w:color="D6E0EA"/>
+              <w:insideH w:val="single" w:sz="5" w:color="D6E0EA"/>
+              <w:insideV w:val="single" w:sz="5" w:color="D6E0EA"/>
+            </w:tcBorders>
+            <w:shd w:fill="EAF1F7"/>
+          </w:tcPr>
+          <w:p>
+            <w:pPr>
+              <w:spacing w:before="0" w:after="0" w:line="240" w:lineRule="auto"/>
+              <w:jc w:val="center"/>
+            </w:pPr>
+            <w:r>
+              <w:rPr>
+                <w:rFonts w:ascii="Aptos" w:hAnsi="Aptos" w:eastAsia="Microsoft YaHei"/>
+                <w:b/>
+                <w:color w:val="243B53"/>
+                <w:sz w:val="21"/>
+              </w:rPr>
+              <w:t>实验日期</w:t>
+            </w:r>
+          </w:p>
+        </w:tc>
+        <w:tc>
+          <w:tcPr>
+            <w:tcW w:type="dxa" w:w="3096"/>
+            <w:vAlign w:val="center"/>
+            <w:tcMar>
+              <w:top w:w="115" w:type="dxa"/>
+              <w:bottom w:w="115" w:type="dxa"/>
+              <w:left w:w="115" w:type="dxa"/>
+              <w:right w:w="115" w:type="dxa"/>
+            </w:tcMar>
+            <w:tcBorders>
+              <w:top w:val="single" w:sz="5" w:color="D6E0EA"/>
+              <w:left w:val="single" w:sz="5" w:color="D6E0EA"/>
+              <w:bottom w:val="single" w:sz="5" w:color="D6E0EA"/>
+              <w:right w:val="single" w:sz="5" w:color="D6E0EA"/>
+              <w:insideH w:val="single" w:sz="5" w:color="D6E0EA"/>
+              <w:insideV w:val="single" w:sz="5" w:color="D6E0EA"/>
+            </w:tcBorders>
+          </w:tcPr>
+          <w:p>
+            <w:pPr>
+              <w:spacing w:before="0" w:after="0" w:line="240" w:lineRule="auto"/>
+              <w:jc w:val="center"/>
+            </w:pPr>
+            <w:r>
+              <w:rPr>
+                <w:rFonts w:ascii="Aptos" w:hAnsi="Aptos" w:eastAsia="Microsoft YaHei"/>
+                <w:color w:val="243B53"/>
+                <w:sz w:val="21"/>
+              </w:rPr>
+              <w:t>2026年10月5日</w:t>
+            </w:r>
+          </w:p>
+        </w:tc>
+      </w:tr>
+      <w:tr>
+        <w:trPr>
+          <w:cantSplit/>
+        </w:trPr>
+        <w:tc>
+          <w:tcPr>
+            <w:tcW w:type="dxa" w:w="1181"/>
+            <w:vAlign w:val="center"/>
+            <w:tcMar>
+              <w:top w:w="115" w:type="dxa"/>
+              <w:bottom w:w="115" w:type="dxa"/>
+              <w:left w:w="115" w:type="dxa"/>
+              <w:right w:w="115" w:type="dxa"/>
+            </w:tcMar>
+            <w:tcBorders>
+              <w:top w:val="single" w:sz="5" w:color="D6E0EA"/>
+              <w:left w:val="single" w:sz="5" w:color="D6E0EA"/>
+              <w:bottom w:val="single" w:sz="5" w:color="D6E0EA"/>
+              <w:right w:val="single" w:sz="5" w:color="D6E0EA"/>
+              <w:insideH w:val="single" w:sz="5" w:color="D6E0EA"/>
+              <w:insideV w:val="single" w:sz="5" w:color="D6E0EA"/>
+            </w:tcBorders>
+            <w:shd w:fill="EAF1F7"/>
+          </w:tcPr>
+          <w:p>
+            <w:pPr>
+              <w:spacing w:before="0" w:after="0" w:line="240" w:lineRule="auto"/>
+              <w:jc w:val="center"/>
+            </w:pPr>
+            <w:r>
+              <w:rPr>
+                <w:rFonts w:ascii="Aptos" w:hAnsi="Aptos" w:eastAsia="Microsoft YaHei"/>
+                <w:b/>
+                <w:color w:val="243B53"/>
+                <w:sz w:val="21"/>
+              </w:rPr>
+              <w:t>总评成绩</w:t>
+            </w:r>
+          </w:p>
+        </w:tc>
+        <w:tc>
+          <w:tcPr>
+            <w:tcW w:type="dxa" w:w="2851"/>
+            <w:vAlign w:val="center"/>
+            <w:tcMar>
+              <w:top w:w="115" w:type="dxa"/>
+              <w:bottom w:w="115" w:type="dxa"/>
+              <w:left w:w="115" w:type="dxa"/>
+              <w:right w:w="115" w:type="dxa"/>
+            </w:tcMar>
+            <w:tcBorders>
+              <w:top w:val="single" w:sz="5" w:color="D6E0EA"/>
+              <w:left w:val="single" w:sz="5" w:color="D6E0EA"/>
+              <w:bottom w:val="single" w:sz="5" w:color="D6E0EA"/>
+              <w:right w:val="single" w:sz="5" w:color="D6E0EA"/>
+              <w:insideH w:val="single" w:sz="5" w:color="D6E0EA"/>
+              <w:insideV w:val="single" w:sz="5" w:color="D6E0EA"/>
+            </w:tcBorders>
+          </w:tcPr>
+          <w:p>
+            <w:pPr>
+              <w:spacing w:before="0" w:after="0" w:line="240" w:lineRule="auto"/>
+              <w:jc w:val="center"/>
+            </w:pPr>
+            <w:r>
+              <w:rPr>
+                <w:rFonts w:ascii="Aptos" w:hAnsi="Aptos" w:eastAsia="Microsoft YaHei"/>
+                <w:color w:val="243B53"/>
+                <w:sz w:val="21"/>
+              </w:rPr>
+            </w:r>
+          </w:p>
+        </w:tc>
+        <w:tc>
+          <w:tcPr>
+            <w:tcW w:type="dxa" w:w="1181"/>
+            <w:vAlign w:val="center"/>
+            <w:tcMar>
+              <w:top w:w="115" w:type="dxa"/>
+              <w:bottom w:w="115" w:type="dxa"/>
+              <w:left w:w="115" w:type="dxa"/>
+              <w:right w:w="115" w:type="dxa"/>
+            </w:tcMar>
+            <w:tcBorders>
+              <w:top w:val="single" w:sz="5" w:color="D6E0EA"/>
+              <w:left w:val="single" w:sz="5" w:color="D6E0EA"/>
+              <w:bottom w:val="single" w:sz="5" w:color="D6E0EA"/>
+              <w:right w:val="single" w:sz="5" w:color="D6E0EA"/>
+              <w:insideH w:val="single" w:sz="5" w:color="D6E0EA"/>
+              <w:insideV w:val="single" w:sz="5" w:color="D6E0EA"/>
+            </w:tcBorders>
+            <w:shd w:fill="EAF1F7"/>
+          </w:tcPr>
+          <w:p>
+            <w:pPr>
+              <w:spacing w:before="0" w:after="0" w:line="240" w:lineRule="auto"/>
+              <w:jc w:val="center"/>
+            </w:pPr>
+            <w:r>
+              <w:rPr>
+                <w:rFonts w:ascii="Aptos" w:hAnsi="Aptos" w:eastAsia="Microsoft YaHei"/>
+                <w:b/>
+                <w:color w:val="243B53"/>
+                <w:sz w:val="21"/>
+              </w:rPr>
+              <w:t>审阅教师</w:t>
+            </w:r>
+          </w:p>
+        </w:tc>
+        <w:tc>
+          <w:tcPr>
+            <w:tcW w:type="dxa" w:w="3096"/>
+            <w:vAlign w:val="center"/>
+            <w:tcMar>
+              <w:top w:w="115" w:type="dxa"/>
+              <w:bottom w:w="115" w:type="dxa"/>
+              <w:left w:w="115" w:type="dxa"/>
+              <w:right w:w="115" w:type="dxa"/>
+            </w:tcMar>
+            <w:tcBorders>
+              <w:top w:val="single" w:sz="5" w:color="D6E0EA"/>
+              <w:left w:val="single" w:sz="5" w:color="D6E0EA"/>
+              <w:bottom w:val="single" w:sz="5" w:color="D6E0EA"/>
+              <w:right w:val="single" w:sz="5" w:color="D6E0EA"/>
+              <w:insideH w:val="single" w:sz="5" w:color="D6E0EA"/>
+              <w:insideV w:val="single" w:sz="5" w:color="D6E0EA"/>
+            </w:tcBorders>
+          </w:tcPr>
+          <w:p>
+            <w:pPr>
+              <w:spacing w:before="0" w:after="0" w:line="240" w:lineRule="auto"/>
+              <w:jc w:val="center"/>
+            </w:pPr>
+            <w:r>
+              <w:rPr>
+                <w:rFonts w:ascii="Aptos" w:hAnsi="Aptos" w:eastAsia="Microsoft YaHei"/>
+                <w:color w:val="243B53"/>
+                <w:sz w:val="21"/>
+              </w:rPr>
+            </w:r>
+          </w:p>
+        </w:tc>
+      </w:tr>
+    </w:tbl>
+    <w:p>
+      <w:pPr>
+        <w:spacing w:before="0" w:after="0"/>
+      </w:pPr>
+    </w:p>
+    <w:p>
+      <w:pPr>
+        <w:pStyle w:val="3"/>
+        <w:keepNext/>
+        <w:pageBreakBefore/>
+        <w:spacing w:before="200" w:after="80"/>
+        <w:ind w:left="0" w:right="0" w:firstLine="0"/>
+        <w:jc w:val="left"/>
+      </w:pPr>
+      <w:r>
+        <w:rPr>
+          <w:rFonts w:ascii="Aptos" w:hAnsi="Aptos" w:eastAsia="Microsoft YaHei"/>
           <w:b/>
-          <w:bCs/>
-          <w:sz w:val="52"/>
-        </w:rPr>
-        <w:t>《软件工程》</w:t>
-      </w:r>
-    </w:p>
-    <w:p>
-      <w:pPr>
-        <w:spacing w:line="480" w:lineRule="auto"/>
-        <w:jc w:val="center"/>
-        <w:outlineLvl w:val="9"/>
-        <w:rPr>
-          <w:rFonts w:hint="default" w:ascii="楷体_GB2312" w:eastAsia="楷体_GB2312"/>
-          <w:b/>
-          <w:bCs/>
-          <w:sz w:val="52"/>
-          <w:lang w:val="en-US" w:eastAsia="zh-CN"/>
-        </w:rPr>
-      </w:pPr>
-      <w:r>
-        <w:rPr>
-          <w:rFonts w:hint="eastAsia" w:ascii="楷体_GB2312" w:eastAsia="楷体_GB2312"/>
-          <w:b/>
-          <w:bCs/>
-          <w:sz w:val="48"/>
-          <w:szCs w:val="22"/>
-        </w:rPr>
-        <w:t>实验报告一：个人编程技能和git操作</w:t>
-      </w:r>
-    </w:p>
-    <w:p>
-      <w:pPr>
-        <w:spacing w:line="440" w:lineRule="exact"/>
-        <w:ind w:left="420" w:leftChars="200" w:firstLine="420" w:firstLineChars="200"/>
-        <w:jc w:val="left"/>
-      </w:pPr>
-    </w:p>
-    <w:p>
-      <w:pPr>
-        <w:spacing w:line="440" w:lineRule="exact"/>
-        <w:ind w:left="420" w:leftChars="200" w:firstLine="420" w:firstLineChars="200"/>
-        <w:jc w:val="left"/>
-      </w:pPr>
-    </w:p>
-    <w:p>
-      <w:pPr>
-        <w:spacing w:line="440" w:lineRule="exact"/>
-        <w:ind w:left="420" w:leftChars="200" w:firstLine="420" w:firstLineChars="200"/>
-        <w:jc w:val="left"/>
-      </w:pPr>
-      <w:bookmarkStart w:id="0" w:name="_GoBack"/>
-      <w:bookmarkEnd w:id="0"/>
-    </w:p>
-    <w:p>
-      <w:pPr>
-        <w:spacing w:line="440" w:lineRule="exact"/>
-        <w:ind w:left="420" w:leftChars="200" w:firstLine="420" w:firstLineChars="200"/>
-        <w:jc w:val="left"/>
-      </w:pPr>
-    </w:p>
-    <w:p>
-      <w:pPr>
-        <w:spacing w:line="440" w:lineRule="exact"/>
-        <w:ind w:left="420" w:leftChars="200" w:firstLine="420" w:firstLineChars="200"/>
-        <w:jc w:val="left"/>
-      </w:pPr>
-    </w:p>
-    <w:p>
-      <w:pPr>
-        <w:spacing w:line="440" w:lineRule="exact"/>
-        <w:ind w:left="420" w:leftChars="200" w:firstLine="420" w:firstLineChars="200"/>
-        <w:jc w:val="left"/>
-      </w:pPr>
-    </w:p>
-    <w:p>
-      <w:pPr>
-        <w:spacing w:line="440" w:lineRule="exact"/>
-        <w:ind w:left="420" w:leftChars="200" w:firstLine="420" w:firstLineChars="200"/>
-        <w:jc w:val="left"/>
-      </w:pPr>
-    </w:p>
-    <w:p>
-      <w:pPr>
-        <w:rPr>
-          <w:b/>
+          <w:color w:val="17365D"/>
           <w:sz w:val="28"/>
-          <w:szCs w:val="28"/>
-        </w:rPr>
-      </w:pPr>
-    </w:p>
-    <w:p>
-      <w:pPr>
-        <w:rPr>
-          <w:b/>
-          <w:sz w:val="48"/>
-          <w:szCs w:val="48"/>
-        </w:rPr>
-      </w:pPr>
-      <w:r>
-        <w:rPr>
-          <w:rFonts w:hint="eastAsia"/>
-          <w:b/>
-          <w:sz w:val="28"/>
-          <w:szCs w:val="28"/>
-        </w:rPr>
-        <w:t xml:space="preserve">                            </w:t>
-      </w:r>
-    </w:p>
-    <w:p>
-      <w:pPr>
-        <w:rPr>
-          <w:sz w:val="28"/>
-          <w:szCs w:val="28"/>
-          <w:u w:val="single"/>
-        </w:rPr>
-      </w:pPr>
-      <w:r>
-        <w:rPr>
-          <w:rFonts w:hint="eastAsia"/>
-          <w:b/>
-          <w:sz w:val="28"/>
-          <w:szCs w:val="28"/>
-        </w:rPr>
-        <w:t>姓    名：钱锐                       学    号：202380010733</w:t>
-      </w:r>
-    </w:p>
-    <w:p>
-      <w:pPr>
-        <w:rPr>
-          <w:rFonts w:hint="default"/>
-          <w:sz w:val="28"/>
-          <w:szCs w:val="28"/>
-          <w:u w:val="single"/>
-          <w:lang w:val="en-US" w:eastAsia="zh-CN"/>
-        </w:rPr>
-      </w:pPr>
-      <w:r>
-        <w:rPr>
-          <w:rFonts w:hint="eastAsia"/>
-          <w:b/>
-          <w:sz w:val="28"/>
-          <w:szCs w:val="28"/>
-        </w:rPr>
-        <w:t>院    系：计算机与信息学院      专  业：计算机科学与技术</w:t>
-      </w:r>
-    </w:p>
-    <w:p>
-      <w:pPr>
-        <w:rPr>
-          <w:b/>
-          <w:sz w:val="28"/>
-          <w:szCs w:val="28"/>
-        </w:rPr>
-      </w:pPr>
-      <w:r>
-        <w:rPr>
-          <w:rFonts w:hint="eastAsia"/>
-          <w:b/>
-          <w:sz w:val="28"/>
-          <w:szCs w:val="28"/>
-        </w:rPr>
-        <w:t>实 验 室：                        实验日期：2026年10月5日</w:t>
-      </w:r>
-    </w:p>
-    <w:p>
-      <w:pPr>
-        <w:rPr>
-          <w:sz w:val="28"/>
-          <w:szCs w:val="28"/>
-          <w:u w:val="single"/>
-        </w:rPr>
-      </w:pPr>
-      <w:r>
-        <w:rPr>
-          <w:rFonts w:hint="eastAsia"/>
-          <w:b/>
-          <w:sz w:val="28"/>
-          <w:szCs w:val="28"/>
-        </w:rPr>
-        <w:t>总评成绩：                        审阅教师：</w:t>
-      </w:r>
-    </w:p>
-    <w:p>
-      <w:pPr>
-        <w:spacing w:line="440" w:lineRule="exact"/>
-        <w:ind w:left="420" w:leftChars="200" w:firstLine="420" w:firstLineChars="200"/>
-        <w:jc w:val="left"/>
-      </w:pPr>
-    </w:p>
-    <w:p>
-      <w:pPr>
-        <w:outlineLvl w:val="9"/>
-        <w:rPr>
-          <w:rFonts w:eastAsia="宋体"/>
-        </w:rPr>
-      </w:pPr>
-    </w:p>
-    <w:p>
-      <w:pPr>
-        <w:pStyle w:val="3"/>
-      </w:pPr>
-      <w:r>
+        </w:rPr>
         <w:t>一、实验目的</w:t>
       </w:r>
     </w:p>
@@ -228,10 +697,6 @@
         <w:keepNext w:val="0"/>
         <w:keepLines w:val="0"/>
         <w:widowControl/>
-        <w:numPr>
-          <w:ilvl w:val="0"/>
-          <w:numId w:val="0"/>
-        </w:numPr>
         <w:suppressLineNumbers w:val="0"/>
         <w:pBdr>
           <w:top w:val="none" w:color="auto" w:sz="0" w:space="0"/>
@@ -239,8 +704,8 @@
           <w:bottom w:val="none" w:color="auto" w:sz="0" w:space="0"/>
           <w:right w:val="none" w:color="auto" w:sz="0" w:space="0"/>
         </w:pBdr>
-        <w:spacing w:before="0" w:beforeAutospacing="0" w:after="210" w:afterAutospacing="0"/>
-        <w:ind w:left="-360" w:leftChars="0" w:right="0" w:rightChars="0"/>
+        <w:spacing w:before="0" w:beforeAutospacing="0" w:after="60" w:afterAutospacing="0" w:line="259" w:lineRule="auto"/>
+        <w:ind w:left="0" w:leftChars="0" w:right="0" w:rightChars="0" w:firstLine="0"/>
         <w:jc w:val="left"/>
         <w:rPr>
           <w:rFonts w:hint="default" w:ascii="Helvetica" w:hAnsi="Helvetica" w:eastAsia="Helvetica" w:cs="Helvetica"/>
@@ -254,6 +719,10 @@
         </w:rPr>
       </w:pPr>
       <w:r>
+        <w:rPr>
+          <w:rFonts w:ascii="Aptos" w:hAnsi="Aptos" w:eastAsia="Microsoft YaHei"/>
+          <w:sz w:val="21"/>
+        </w:rPr>
         <w:t>理解 Git 对个人源代码的版本管理作用，掌握本地仓库与远程仓库之间的基本协作流程。</w:t>
       </w:r>
     </w:p>
@@ -262,10 +731,6 @@
         <w:keepNext w:val="0"/>
         <w:keepLines w:val="0"/>
         <w:widowControl/>
-        <w:numPr>
-          <w:ilvl w:val="0"/>
-          <w:numId w:val="0"/>
-        </w:numPr>
         <w:suppressLineNumbers w:val="0"/>
         <w:pBdr>
           <w:top w:val="none" w:color="auto" w:sz="0" w:space="0"/>
@@ -273,8 +738,8 @@
           <w:bottom w:val="none" w:color="auto" w:sz="0" w:space="0"/>
           <w:right w:val="none" w:color="auto" w:sz="0" w:space="0"/>
         </w:pBdr>
-        <w:spacing w:before="0" w:beforeAutospacing="0" w:after="210" w:afterAutospacing="0"/>
-        <w:ind w:left="-360" w:leftChars="0" w:right="0" w:rightChars="0"/>
+        <w:spacing w:before="0" w:beforeAutospacing="0" w:after="60" w:afterAutospacing="0" w:line="259" w:lineRule="auto"/>
+        <w:ind w:left="0" w:leftChars="0" w:right="0" w:rightChars="0" w:firstLine="0"/>
         <w:jc w:val="left"/>
         <w:rPr>
           <w:rFonts w:hint="default" w:ascii="Helvetica" w:hAnsi="Helvetica" w:eastAsia="Helvetica" w:cs="Helvetica"/>
@@ -288,6 +753,10 @@
         </w:rPr>
       </w:pPr>
       <w:r>
+        <w:rPr>
+          <w:rFonts w:ascii="Aptos" w:hAnsi="Aptos" w:eastAsia="Microsoft YaHei"/>
+          <w:sz w:val="21"/>
+        </w:rPr>
         <w:t>以 Python 实现 HJ212-2017 报文解析器，练习协议边界校验、CRC16、键值数据解析和监测因子提取。</w:t>
       </w:r>
     </w:p>
@@ -296,10 +765,6 @@
         <w:keepNext w:val="0"/>
         <w:keepLines w:val="0"/>
         <w:widowControl/>
-        <w:numPr>
-          <w:ilvl w:val="0"/>
-          <w:numId w:val="0"/>
-        </w:numPr>
         <w:suppressLineNumbers w:val="0"/>
         <w:pBdr>
           <w:top w:val="none" w:color="auto" w:sz="0" w:space="0"/>
@@ -307,8 +772,8 @@
           <w:bottom w:val="none" w:color="auto" w:sz="0" w:space="0"/>
           <w:right w:val="none" w:color="auto" w:sz="0" w:space="0"/>
         </w:pBdr>
-        <w:spacing w:before="0" w:beforeAutospacing="0" w:after="210" w:afterAutospacing="0"/>
-        <w:ind w:left="-360" w:leftChars="0" w:right="0" w:rightChars="0"/>
+        <w:spacing w:before="0" w:beforeAutospacing="0" w:after="60" w:afterAutospacing="0" w:line="259" w:lineRule="auto"/>
+        <w:ind w:left="0" w:leftChars="0" w:right="0" w:rightChars="0" w:firstLine="0"/>
         <w:jc w:val="left"/>
         <w:rPr>
           <w:rFonts w:hint="default" w:ascii="Helvetica" w:hAnsi="Helvetica" w:eastAsia="Helvetica" w:cs="Helvetica"/>
@@ -322,14 +787,28 @@
         </w:rPr>
       </w:pPr>
       <w:r>
+        <w:rPr>
+          <w:rFonts w:ascii="Aptos" w:hAnsi="Aptos" w:eastAsia="Microsoft YaHei"/>
+          <w:sz w:val="21"/>
+        </w:rPr>
         <w:t>结合公开信理解高质量软件需要在需求、设计、编码、验证和维护的全过程中持续保障。</w:t>
       </w:r>
     </w:p>
     <w:p>
       <w:pPr>
         <w:pStyle w:val="3"/>
-      </w:pPr>
-      <w:r>
+        <w:keepNext/>
+        <w:spacing w:before="200" w:after="80"/>
+        <w:ind w:left="0" w:right="0" w:firstLine="0"/>
+        <w:jc w:val="left"/>
+      </w:pPr>
+      <w:r>
+        <w:rPr>
+          <w:rFonts w:ascii="Aptos" w:hAnsi="Aptos" w:eastAsia="Microsoft YaHei"/>
+          <w:b/>
+          <w:color w:val="17365D"/>
+          <w:sz w:val="28"/>
+        </w:rPr>
         <w:t>二、实验环境</w:t>
       </w:r>
     </w:p>
@@ -338,10 +817,6 @@
         <w:keepNext w:val="0"/>
         <w:keepLines w:val="0"/>
         <w:widowControl/>
-        <w:numPr>
-          <w:ilvl w:val="0"/>
-          <w:numId w:val="0"/>
-        </w:numPr>
         <w:suppressLineNumbers w:val="0"/>
         <w:pBdr>
           <w:top w:val="none" w:color="auto" w:sz="0" w:space="0"/>
@@ -349,8 +824,8 @@
           <w:bottom w:val="none" w:color="auto" w:sz="0" w:space="0"/>
           <w:right w:val="none" w:color="auto" w:sz="0" w:space="0"/>
         </w:pBdr>
-        <w:spacing w:before="0" w:beforeAutospacing="0" w:after="210" w:afterAutospacing="0"/>
-        <w:ind w:left="-360" w:leftChars="0" w:right="0" w:rightChars="0"/>
+        <w:spacing w:before="0" w:beforeAutospacing="0" w:after="60" w:afterAutospacing="0" w:line="259" w:lineRule="auto"/>
+        <w:ind w:left="0" w:leftChars="0" w:right="0" w:rightChars="0" w:firstLine="0"/>
         <w:jc w:val="left"/>
         <w:rPr>
           <w:rFonts w:hint="default" w:ascii="Helvetica" w:hAnsi="Helvetica" w:eastAsia="Helvetica" w:cs="Helvetica"/>
@@ -364,14 +839,28 @@
         </w:rPr>
       </w:pPr>
       <w:r>
+        <w:rPr>
+          <w:rFonts w:ascii="Aptos" w:hAnsi="Aptos" w:eastAsia="Microsoft YaHei"/>
+          <w:sz w:val="21"/>
+        </w:rPr>
         <w:t>编程语言：Python 3；版本管理：Git；代码托管：GitHub 公开仓库；依赖：Python 标准库。</w:t>
       </w:r>
     </w:p>
     <w:p>
       <w:pPr>
         <w:pStyle w:val="3"/>
-      </w:pPr>
-      <w:r>
+        <w:keepNext/>
+        <w:spacing w:before="200" w:after="80"/>
+        <w:ind w:left="0" w:right="0" w:firstLine="0"/>
+        <w:jc w:val="left"/>
+      </w:pPr>
+      <w:r>
+        <w:rPr>
+          <w:rFonts w:ascii="Aptos" w:hAnsi="Aptos" w:eastAsia="Microsoft YaHei"/>
+          <w:b/>
+          <w:color w:val="17365D"/>
+          <w:sz w:val="28"/>
+        </w:rPr>
         <w:t>三、实验要求</w:t>
       </w:r>
     </w:p>
@@ -380,10 +869,6 @@
         <w:keepNext w:val="0"/>
         <w:keepLines w:val="0"/>
         <w:widowControl/>
-        <w:numPr>
-          <w:ilvl w:val="0"/>
-          <w:numId w:val="0"/>
-        </w:numPr>
         <w:suppressLineNumbers w:val="0"/>
         <w:pBdr>
           <w:top w:val="none" w:color="auto" w:sz="0" w:space="0"/>
@@ -391,8 +876,8 @@
           <w:bottom w:val="none" w:color="auto" w:sz="0" w:space="0"/>
           <w:right w:val="none" w:color="auto" w:sz="0" w:space="0"/>
         </w:pBdr>
-        <w:spacing w:before="0" w:beforeAutospacing="0" w:after="210" w:afterAutospacing="0"/>
-        <w:ind w:left="-360" w:leftChars="0" w:right="0" w:rightChars="0"/>
+        <w:spacing w:before="0" w:beforeAutospacing="0" w:after="60" w:afterAutospacing="0" w:line="259" w:lineRule="auto"/>
+        <w:ind w:left="0" w:leftChars="0" w:right="0" w:rightChars="0" w:firstLine="0"/>
         <w:jc w:val="left"/>
         <w:rPr>
           <w:rFonts w:hint="default" w:ascii="Helvetica" w:hAnsi="Helvetica" w:eastAsia="Helvetica" w:cs="Helvetica"/>
@@ -406,6 +891,10 @@
         </w:rPr>
       </w:pPr>
       <w:r>
+        <w:rPr>
+          <w:rFonts w:ascii="Aptos" w:hAnsi="Aptos" w:eastAsia="Microsoft YaHei"/>
+          <w:sz w:val="21"/>
+        </w:rPr>
         <w:t>1. 建立个人代码仓库，按有意义的阶段提交源代码、实验说明和检查记录。</w:t>
       </w:r>
     </w:p>
@@ -414,10 +903,6 @@
         <w:keepNext w:val="0"/>
         <w:keepLines w:val="0"/>
         <w:widowControl/>
-        <w:numPr>
-          <w:ilvl w:val="0"/>
-          <w:numId w:val="0"/>
-        </w:numPr>
         <w:suppressLineNumbers w:val="0"/>
         <w:pBdr>
           <w:top w:val="none" w:color="auto" w:sz="0" w:space="0"/>
@@ -425,8 +910,8 @@
           <w:bottom w:val="none" w:color="auto" w:sz="0" w:space="0"/>
           <w:right w:val="none" w:color="auto" w:sz="0" w:space="0"/>
         </w:pBdr>
-        <w:spacing w:before="0" w:beforeAutospacing="0" w:after="210" w:afterAutospacing="0"/>
-        <w:ind w:left="-360" w:leftChars="0" w:right="0" w:rightChars="0"/>
+        <w:spacing w:before="0" w:beforeAutospacing="0" w:after="60" w:afterAutospacing="0" w:line="259" w:lineRule="auto"/>
+        <w:ind w:left="0" w:leftChars="0" w:right="0" w:rightChars="0" w:firstLine="0"/>
         <w:jc w:val="left"/>
         <w:rPr>
           <w:rFonts w:hint="default" w:ascii="Helvetica" w:hAnsi="Helvetica" w:eastAsia="Helvetica" w:cs="Helvetica"/>
@@ -440,6 +925,10 @@
         </w:rPr>
       </w:pPr>
       <w:r>
+        <w:rPr>
+          <w:rFonts w:ascii="Aptos" w:hAnsi="Aptos" w:eastAsia="Microsoft YaHei"/>
+          <w:sz w:val="21"/>
+        </w:rPr>
         <w:t>2. 独立完成编程任务；利用 AI 辅助梳理协议结构和实现思路，并对生成建议进行人工核对。</w:t>
       </w:r>
     </w:p>
@@ -448,10 +937,6 @@
         <w:keepNext w:val="0"/>
         <w:keepLines w:val="0"/>
         <w:widowControl/>
-        <w:numPr>
-          <w:ilvl w:val="0"/>
-          <w:numId w:val="0"/>
-        </w:numPr>
         <w:suppressLineNumbers w:val="0"/>
         <w:pBdr>
           <w:top w:val="none" w:color="auto" w:sz="0" w:space="0"/>
@@ -459,8 +944,8 @@
           <w:bottom w:val="none" w:color="auto" w:sz="0" w:space="0"/>
           <w:right w:val="none" w:color="auto" w:sz="0" w:space="0"/>
         </w:pBdr>
-        <w:spacing w:before="0" w:beforeAutospacing="0" w:after="210" w:afterAutospacing="0"/>
-        <w:ind w:left="-360" w:leftChars="0" w:right="0" w:rightChars="0"/>
+        <w:spacing w:before="0" w:beforeAutospacing="0" w:after="60" w:afterAutospacing="0" w:line="259" w:lineRule="auto"/>
+        <w:ind w:left="0" w:leftChars="0" w:right="0" w:rightChars="0" w:firstLine="0"/>
         <w:jc w:val="left"/>
         <w:rPr>
           <w:rFonts w:hint="default" w:ascii="Helvetica" w:hAnsi="Helvetica" w:eastAsia="Helvetica" w:cs="Helvetica"/>
@@ -474,6 +959,10 @@
         </w:rPr>
       </w:pPr>
       <w:r>
+        <w:rPr>
+          <w:rFonts w:ascii="Aptos" w:hAnsi="Aptos" w:eastAsia="Microsoft YaHei"/>
+          <w:sz w:val="21"/>
+        </w:rPr>
         <w:t>3. 实现报文格式合法性验证、ANSI CRC16 校验、数据段结构化解析及 CP 监测数据提取。</w:t>
       </w:r>
     </w:p>
@@ -482,10 +971,6 @@
         <w:keepNext w:val="0"/>
         <w:keepLines w:val="0"/>
         <w:widowControl/>
-        <w:numPr>
-          <w:ilvl w:val="0"/>
-          <w:numId w:val="0"/>
-        </w:numPr>
         <w:suppressLineNumbers w:val="0"/>
         <w:pBdr>
           <w:top w:val="none" w:color="auto" w:sz="0" w:space="0"/>
@@ -493,8 +978,8 @@
           <w:bottom w:val="none" w:color="auto" w:sz="0" w:space="0"/>
           <w:right w:val="none" w:color="auto" w:sz="0" w:space="0"/>
         </w:pBdr>
-        <w:spacing w:before="0" w:beforeAutospacing="0" w:after="210" w:afterAutospacing="0"/>
-        <w:ind w:left="-360" w:leftChars="0" w:right="0" w:rightChars="0"/>
+        <w:spacing w:before="0" w:beforeAutospacing="0" w:after="60" w:afterAutospacing="0" w:line="259" w:lineRule="auto"/>
+        <w:ind w:left="0" w:leftChars="0" w:right="0" w:rightChars="0" w:firstLine="0"/>
         <w:jc w:val="left"/>
         <w:rPr>
           <w:rFonts w:hint="default" w:ascii="Helvetica" w:hAnsi="Helvetica" w:eastAsia="Helvetica" w:cs="Helvetica"/>
@@ -508,22 +993,46 @@
         </w:rPr>
       </w:pPr>
       <w:r>
+        <w:rPr>
+          <w:rFonts w:ascii="Aptos" w:hAnsi="Aptos" w:eastAsia="Microsoft YaHei"/>
+          <w:sz w:val="21"/>
+        </w:rPr>
         <w:t>4. 参照模板完成实验报告，并将源代码、回归用例和报告提交到 GitHub 公开仓库。</w:t>
       </w:r>
     </w:p>
     <w:p>
       <w:pPr>
         <w:pStyle w:val="3"/>
-      </w:pPr>
-      <w:r>
+        <w:keepNext/>
+        <w:spacing w:before="200" w:after="80"/>
+        <w:ind w:left="0" w:right="0" w:firstLine="0"/>
+        <w:jc w:val="left"/>
+      </w:pPr>
+      <w:r>
+        <w:rPr>
+          <w:rFonts w:ascii="Aptos" w:hAnsi="Aptos" w:eastAsia="Microsoft YaHei"/>
+          <w:b/>
+          <w:color w:val="17365D"/>
+          <w:sz w:val="28"/>
+        </w:rPr>
         <w:t>四、实验内容</w:t>
       </w:r>
     </w:p>
     <w:p>
       <w:pPr>
         <w:pStyle w:val="3"/>
-      </w:pPr>
-      <w:r>
+        <w:keepNext/>
+        <w:spacing w:before="140" w:after="40"/>
+        <w:ind w:left="0" w:right="0" w:firstLine="0"/>
+        <w:jc w:val="left"/>
+      </w:pPr>
+      <w:r>
+        <w:rPr>
+          <w:rFonts w:ascii="Aptos" w:hAnsi="Aptos" w:eastAsia="Microsoft YaHei"/>
+          <w:b/>
+          <w:color w:val="2C5F7C"/>
+          <w:sz w:val="23"/>
+        </w:rPr>
         <w:t>（一）Git 基本操作</w:t>
       </w:r>
     </w:p>
@@ -532,10 +1041,6 @@
         <w:keepNext w:val="0"/>
         <w:keepLines w:val="0"/>
         <w:widowControl/>
-        <w:numPr>
-          <w:ilvl w:val="0"/>
-          <w:numId w:val="0"/>
-        </w:numPr>
         <w:suppressLineNumbers w:val="0"/>
         <w:pBdr>
           <w:top w:val="none" w:color="auto" w:sz="0" w:space="0"/>
@@ -543,8 +1048,8 @@
           <w:bottom w:val="none" w:color="auto" w:sz="0" w:space="0"/>
           <w:right w:val="none" w:color="auto" w:sz="0" w:space="0"/>
         </w:pBdr>
-        <w:spacing w:before="0" w:beforeAutospacing="0" w:after="210" w:afterAutospacing="0"/>
-        <w:ind w:left="-360" w:leftChars="0" w:right="0" w:rightChars="0"/>
+        <w:spacing w:before="0" w:beforeAutospacing="0" w:after="60" w:afterAutospacing="0" w:line="259" w:lineRule="auto"/>
+        <w:ind w:left="0" w:leftChars="0" w:right="0" w:rightChars="0" w:firstLine="0"/>
         <w:jc w:val="left"/>
         <w:rPr>
           <w:rFonts w:hint="default" w:ascii="Helvetica" w:hAnsi="Helvetica" w:eastAsia="Helvetica" w:cs="Helvetica"/>
@@ -558,6 +1063,10 @@
         </w:rPr>
       </w:pPr>
       <w:r>
+        <w:rPr>
+          <w:rFonts w:ascii="Aptos" w:hAnsi="Aptos" w:eastAsia="Microsoft YaHei"/>
+          <w:sz w:val="21"/>
+        </w:rPr>
         <w:t>Git 将代码变更记录为可追溯的提交。本实验已创建 GitHub 公开仓库，默认分支为 main，并开启 Python .gitignore 与 README。日常工作流为检查状态、暂存变更、提交并推送；提交说明写明改动目的，开始修改前同步远程变更，推送前检查状态和提交记录。</w:t>
       </w:r>
     </w:p>
@@ -566,10 +1075,6 @@
         <w:keepNext w:val="0"/>
         <w:keepLines w:val="0"/>
         <w:widowControl/>
-        <w:numPr>
-          <w:ilvl w:val="0"/>
-          <w:numId w:val="0"/>
-        </w:numPr>
         <w:suppressLineNumbers w:val="0"/>
         <w:pBdr>
           <w:top w:val="none" w:color="auto" w:sz="0" w:space="0"/>
@@ -577,8 +1082,8 @@
           <w:bottom w:val="none" w:color="auto" w:sz="0" w:space="0"/>
           <w:right w:val="none" w:color="auto" w:sz="0" w:space="0"/>
         </w:pBdr>
-        <w:spacing w:before="0" w:beforeAutospacing="0" w:after="210" w:afterAutospacing="0"/>
-        <w:ind w:left="-360" w:leftChars="0" w:right="0" w:rightChars="0"/>
+        <w:spacing w:before="0" w:beforeAutospacing="0" w:after="40" w:afterAutospacing="0" w:line="252" w:lineRule="auto"/>
+        <w:ind w:left="0" w:leftChars="0" w:right="0" w:rightChars="0" w:firstLine="0"/>
         <w:jc w:val="left"/>
         <w:rPr>
           <w:rFonts w:hint="default" w:ascii="Helvetica" w:hAnsi="Helvetica" w:eastAsia="Helvetica" w:cs="Helvetica"/>
@@ -604,10 +1109,6 @@
         <w:keepNext w:val="0"/>
         <w:keepLines w:val="0"/>
         <w:widowControl/>
-        <w:numPr>
-          <w:ilvl w:val="0"/>
-          <w:numId w:val="0"/>
-        </w:numPr>
         <w:suppressLineNumbers w:val="0"/>
         <w:pBdr>
           <w:top w:val="none" w:color="auto" w:sz="0" w:space="0"/>
@@ -615,8 +1116,8 @@
           <w:bottom w:val="none" w:color="auto" w:sz="0" w:space="0"/>
           <w:right w:val="none" w:color="auto" w:sz="0" w:space="0"/>
         </w:pBdr>
-        <w:spacing w:before="0" w:beforeAutospacing="0" w:after="210" w:afterAutospacing="0"/>
-        <w:ind w:left="-360" w:leftChars="0" w:right="0" w:rightChars="0"/>
+        <w:spacing w:before="0" w:beforeAutospacing="0" w:after="60" w:afterAutospacing="0" w:line="259" w:lineRule="auto"/>
+        <w:ind w:left="0" w:leftChars="0" w:right="0" w:rightChars="0" w:firstLine="0"/>
         <w:jc w:val="left"/>
         <w:rPr>
           <w:rFonts w:hint="default" w:ascii="Helvetica" w:hAnsi="Helvetica" w:eastAsia="Helvetica" w:cs="Helvetica"/>
@@ -630,22 +1131,46 @@
         </w:rPr>
       </w:pPr>
       <w:r>
+        <w:rPr>
+          <w:rFonts w:ascii="Aptos" w:hAnsi="Aptos" w:eastAsia="Microsoft YaHei"/>
+          <w:sz w:val="21"/>
+        </w:rPr>
         <w:t>克隆已有仓库时先执行 git clone &lt;仓库URL&gt;；开始修改前用 git pull 同步远程变更，推送前用 git status 和 git log 检查提交内容。远程分支名以仓库实际默认分支为准。</w:t>
       </w:r>
     </w:p>
     <w:p>
       <w:pPr>
         <w:pStyle w:val="3"/>
-      </w:pPr>
-      <w:r>
+        <w:keepNext/>
+        <w:spacing w:before="140" w:after="40"/>
+        <w:ind w:left="0" w:right="0" w:firstLine="0"/>
+        <w:jc w:val="left"/>
+      </w:pPr>
+      <w:r>
+        <w:rPr>
+          <w:rFonts w:ascii="Aptos" w:hAnsi="Aptos" w:eastAsia="Microsoft YaHei"/>
+          <w:b/>
+          <w:color w:val="2C5F7C"/>
+          <w:sz w:val="23"/>
+        </w:rPr>
         <w:t>（二）HJ212-2017 报文解析器</w:t>
       </w:r>
     </w:p>
     <w:p>
       <w:pPr>
         <w:pStyle w:val="3"/>
-      </w:pPr>
-      <w:r>
+        <w:keepNext/>
+        <w:spacing w:before="140" w:after="40"/>
+        <w:ind w:left="0" w:right="0" w:firstLine="0"/>
+        <w:jc w:val="left"/>
+      </w:pPr>
+      <w:r>
+        <w:rPr>
+          <w:rFonts w:ascii="Aptos" w:hAnsi="Aptos" w:eastAsia="Microsoft YaHei"/>
+          <w:b/>
+          <w:color w:val="2C5F7C"/>
+          <w:sz w:val="23"/>
+        </w:rPr>
         <w:t>1. 报文结构与解析边界</w:t>
       </w:r>
     </w:p>
@@ -654,10 +1179,6 @@
         <w:keepNext w:val="0"/>
         <w:keepLines w:val="0"/>
         <w:widowControl/>
-        <w:numPr>
-          <w:ilvl w:val="0"/>
-          <w:numId w:val="0"/>
-        </w:numPr>
         <w:suppressLineNumbers w:val="0"/>
         <w:pBdr>
           <w:top w:val="none" w:color="auto" w:sz="0" w:space="0"/>
@@ -665,8 +1186,8 @@
           <w:bottom w:val="none" w:color="auto" w:sz="0" w:space="0"/>
           <w:right w:val="none" w:color="auto" w:sz="0" w:space="0"/>
         </w:pBdr>
-        <w:spacing w:before="0" w:beforeAutospacing="0" w:after="210" w:afterAutospacing="0"/>
-        <w:ind w:left="-360" w:leftChars="0" w:right="0" w:rightChars="0"/>
+        <w:spacing w:before="0" w:beforeAutospacing="0" w:after="60" w:afterAutospacing="0" w:line="259" w:lineRule="auto"/>
+        <w:ind w:left="0" w:leftChars="0" w:right="0" w:rightChars="0" w:firstLine="0"/>
         <w:jc w:val="left"/>
         <w:rPr>
           <w:rFonts w:hint="default" w:ascii="Helvetica" w:hAnsi="Helvetica" w:eastAsia="Helvetica" w:cs="Helvetica"/>
@@ -680,14 +1201,28 @@
         </w:rPr>
       </w:pPr>
       <w:r>
+        <w:rPr>
+          <w:rFonts w:ascii="Aptos" w:hAnsi="Aptos" w:eastAsia="Microsoft YaHei"/>
+          <w:sz w:val="21"/>
+        </w:rPr>
         <w:t>按实验说明，完整报文由固定包头“##”、4 位十进制数据段长度、数据段、4 位十六进制 CRC 和回车换行组成。长度只统计数据段字符；CRC 针对数据段计算，不包含包头、长度字段、CRC 本身和结束符。校验通过后再进入字段解析，避免将损坏报文当成有效业务数据。</w:t>
       </w:r>
     </w:p>
     <w:p>
       <w:pPr>
         <w:pStyle w:val="3"/>
-      </w:pPr>
-      <w:r>
+        <w:keepNext/>
+        <w:spacing w:before="140" w:after="40"/>
+        <w:ind w:left="0" w:right="0" w:firstLine="0"/>
+        <w:jc w:val="left"/>
+      </w:pPr>
+      <w:r>
+        <w:rPr>
+          <w:rFonts w:ascii="Aptos" w:hAnsi="Aptos" w:eastAsia="Microsoft YaHei"/>
+          <w:b/>
+          <w:color w:val="2C5F7C"/>
+          <w:sz w:val="23"/>
+        </w:rPr>
         <w:t>2. CRC16 校验</w:t>
       </w:r>
     </w:p>
@@ -696,10 +1231,6 @@
         <w:keepNext w:val="0"/>
         <w:keepLines w:val="0"/>
         <w:widowControl/>
-        <w:numPr>
-          <w:ilvl w:val="0"/>
-          <w:numId w:val="0"/>
-        </w:numPr>
         <w:suppressLineNumbers w:val="0"/>
         <w:pBdr>
           <w:top w:val="none" w:color="auto" w:sz="0" w:space="0"/>
@@ -707,8 +1238,8 @@
           <w:bottom w:val="none" w:color="auto" w:sz="0" w:space="0"/>
           <w:right w:val="none" w:color="auto" w:sz="0" w:space="0"/>
         </w:pBdr>
-        <w:spacing w:before="0" w:beforeAutospacing="0" w:after="210" w:afterAutospacing="0"/>
-        <w:ind w:left="-360" w:leftChars="0" w:right="0" w:rightChars="0"/>
+        <w:spacing w:before="0" w:beforeAutospacing="0" w:after="60" w:afterAutospacing="0" w:line="259" w:lineRule="auto"/>
+        <w:ind w:left="0" w:leftChars="0" w:right="0" w:rightChars="0" w:firstLine="0"/>
         <w:jc w:val="left"/>
         <w:rPr>
           <w:rFonts w:hint="default" w:ascii="Helvetica" w:hAnsi="Helvetica" w:eastAsia="Helvetica" w:cs="Helvetica"/>
@@ -722,6 +1253,10 @@
         </w:rPr>
       </w:pPr>
       <w:r>
+        <w:rPr>
+          <w:rFonts w:ascii="Aptos" w:hAnsi="Aptos" w:eastAsia="Microsoft YaHei"/>
+          <w:sz w:val="21"/>
+        </w:rPr>
         <w:t>CRC16 按 HJ212-2017 附录 A 处理 ASCII 数据段：寄存器初值为 0xFFFF；每个字节先与寄存器高字节异或，即 crc = (crc &gt;&gt; 8) ^ byte，再执行 8 轮最低位右移，最低位为 1 时与多项式 0xA001 异或。结果格式化为 4 位十六进制字符串后与报文校验字段比较。实现时须统一大小写，并确保长度统计与 CRC 输入使用同一份数据段。</w:t>
       </w:r>
     </w:p>
@@ -730,10 +1265,6 @@
         <w:keepNext w:val="0"/>
         <w:keepLines w:val="0"/>
         <w:widowControl/>
-        <w:numPr>
-          <w:ilvl w:val="0"/>
-          <w:numId w:val="0"/>
-        </w:numPr>
         <w:suppressLineNumbers w:val="0"/>
         <w:pBdr>
           <w:top w:val="none" w:color="auto" w:sz="0" w:space="0"/>
@@ -741,8 +1272,8 @@
           <w:bottom w:val="none" w:color="auto" w:sz="0" w:space="0"/>
           <w:right w:val="none" w:color="auto" w:sz="0" w:space="0"/>
         </w:pBdr>
-        <w:spacing w:before="0" w:beforeAutospacing="0" w:after="210" w:afterAutospacing="0"/>
-        <w:ind w:left="-360" w:leftChars="0" w:right="0" w:rightChars="0"/>
+        <w:spacing w:before="0" w:beforeAutospacing="0" w:after="60" w:afterAutospacing="0" w:line="259" w:lineRule="auto"/>
+        <w:ind w:left="0" w:leftChars="0" w:right="0" w:rightChars="0" w:firstLine="0"/>
         <w:jc w:val="left"/>
         <w:rPr>
           <w:rFonts w:hint="default" w:ascii="Helvetica" w:hAnsi="Helvetica" w:eastAsia="Helvetica" w:cs="Helvetica"/>
@@ -756,6 +1287,10 @@
         </w:rPr>
       </w:pPr>
       <w:r>
+        <w:rPr>
+          <w:rFonts w:ascii="Aptos" w:hAnsi="Aptos" w:eastAsia="Microsoft YaHei"/>
+          <w:sz w:val="21"/>
+        </w:rPr>
         <w:t>关键步骤示意：</w:t>
       </w:r>
     </w:p>
@@ -764,10 +1299,6 @@
         <w:keepNext w:val="0"/>
         <w:keepLines w:val="0"/>
         <w:widowControl/>
-        <w:numPr>
-          <w:ilvl w:val="0"/>
-          <w:numId w:val="0"/>
-        </w:numPr>
         <w:suppressLineNumbers w:val="0"/>
         <w:pBdr>
           <w:top w:val="none" w:color="auto" w:sz="0" w:space="0"/>
@@ -775,8 +1306,8 @@
           <w:bottom w:val="none" w:color="auto" w:sz="0" w:space="0"/>
           <w:right w:val="none" w:color="auto" w:sz="0" w:space="0"/>
         </w:pBdr>
-        <w:spacing w:before="0" w:beforeAutospacing="0" w:after="210" w:afterAutospacing="0"/>
-        <w:ind w:left="-360" w:leftChars="0" w:right="0" w:rightChars="0"/>
+        <w:spacing w:before="0" w:beforeAutospacing="0" w:after="40" w:afterAutospacing="0" w:line="252" w:lineRule="auto"/>
+        <w:ind w:left="0" w:leftChars="0" w:right="0" w:rightChars="0" w:firstLine="0"/>
         <w:jc w:val="left"/>
         <w:rPr>
           <w:rFonts w:hint="default" w:ascii="Helvetica" w:hAnsi="Helvetica" w:eastAsia="Helvetica" w:cs="Helvetica"/>
@@ -802,10 +1333,6 @@
         <w:keepNext w:val="0"/>
         <w:keepLines w:val="0"/>
         <w:widowControl/>
-        <w:numPr>
-          <w:ilvl w:val="0"/>
-          <w:numId w:val="0"/>
-        </w:numPr>
         <w:suppressLineNumbers w:val="0"/>
         <w:pBdr>
           <w:top w:val="none" w:color="auto" w:sz="0" w:space="0"/>
@@ -813,8 +1340,8 @@
           <w:bottom w:val="none" w:color="auto" w:sz="0" w:space="0"/>
           <w:right w:val="none" w:color="auto" w:sz="0" w:space="0"/>
         </w:pBdr>
-        <w:spacing w:before="0" w:beforeAutospacing="0" w:after="210" w:afterAutospacing="0"/>
-        <w:ind w:left="-360" w:leftChars="0" w:right="0" w:rightChars="0"/>
+        <w:spacing w:before="0" w:beforeAutospacing="0" w:after="40" w:afterAutospacing="0" w:line="252" w:lineRule="auto"/>
+        <w:ind w:left="0" w:leftChars="0" w:right="0" w:rightChars="0" w:firstLine="0"/>
         <w:jc w:val="left"/>
         <w:rPr>
           <w:rFonts w:hint="default" w:ascii="Helvetica" w:hAnsi="Helvetica" w:eastAsia="Helvetica" w:cs="Helvetica"/>
@@ -840,10 +1367,6 @@
         <w:keepNext w:val="0"/>
         <w:keepLines w:val="0"/>
         <w:widowControl/>
-        <w:numPr>
-          <w:ilvl w:val="0"/>
-          <w:numId w:val="0"/>
-        </w:numPr>
         <w:suppressLineNumbers w:val="0"/>
         <w:pBdr>
           <w:top w:val="none" w:color="auto" w:sz="0" w:space="0"/>
@@ -851,8 +1374,8 @@
           <w:bottom w:val="none" w:color="auto" w:sz="0" w:space="0"/>
           <w:right w:val="none" w:color="auto" w:sz="0" w:space="0"/>
         </w:pBdr>
-        <w:spacing w:before="0" w:beforeAutospacing="0" w:after="210" w:afterAutospacing="0"/>
-        <w:ind w:left="-360" w:leftChars="0" w:right="0" w:rightChars="0"/>
+        <w:spacing w:before="0" w:beforeAutospacing="0" w:after="40" w:afterAutospacing="0" w:line="252" w:lineRule="auto"/>
+        <w:ind w:left="0" w:leftChars="0" w:right="0" w:rightChars="0" w:firstLine="0"/>
         <w:jc w:val="left"/>
         <w:rPr>
           <w:rFonts w:hint="default" w:ascii="Helvetica" w:hAnsi="Helvetica" w:eastAsia="Helvetica" w:cs="Helvetica"/>
@@ -878,10 +1401,6 @@
         <w:keepNext w:val="0"/>
         <w:keepLines w:val="0"/>
         <w:widowControl/>
-        <w:numPr>
-          <w:ilvl w:val="0"/>
-          <w:numId w:val="0"/>
-        </w:numPr>
         <w:suppressLineNumbers w:val="0"/>
         <w:pBdr>
           <w:top w:val="none" w:color="auto" w:sz="0" w:space="0"/>
@@ -889,8 +1408,8 @@
           <w:bottom w:val="none" w:color="auto" w:sz="0" w:space="0"/>
           <w:right w:val="none" w:color="auto" w:sz="0" w:space="0"/>
         </w:pBdr>
-        <w:spacing w:before="0" w:beforeAutospacing="0" w:after="210" w:afterAutospacing="0"/>
-        <w:ind w:left="-360" w:leftChars="0" w:right="0" w:rightChars="0"/>
+        <w:spacing w:before="0" w:beforeAutospacing="0" w:after="40" w:afterAutospacing="0" w:line="252" w:lineRule="auto"/>
+        <w:ind w:left="0" w:leftChars="0" w:right="0" w:rightChars="0" w:firstLine="0"/>
         <w:jc w:val="left"/>
         <w:rPr>
           <w:rFonts w:hint="default" w:ascii="Helvetica" w:hAnsi="Helvetica" w:eastAsia="Helvetica" w:cs="Helvetica"/>
@@ -916,10 +1435,6 @@
         <w:keepNext w:val="0"/>
         <w:keepLines w:val="0"/>
         <w:widowControl/>
-        <w:numPr>
-          <w:ilvl w:val="0"/>
-          <w:numId w:val="0"/>
-        </w:numPr>
         <w:suppressLineNumbers w:val="0"/>
         <w:pBdr>
           <w:top w:val="none" w:color="auto" w:sz="0" w:space="0"/>
@@ -927,8 +1442,8 @@
           <w:bottom w:val="none" w:color="auto" w:sz="0" w:space="0"/>
           <w:right w:val="none" w:color="auto" w:sz="0" w:space="0"/>
         </w:pBdr>
-        <w:spacing w:before="0" w:beforeAutospacing="0" w:after="210" w:afterAutospacing="0"/>
-        <w:ind w:left="-360" w:leftChars="0" w:right="0" w:rightChars="0"/>
+        <w:spacing w:before="0" w:beforeAutospacing="0" w:after="40" w:afterAutospacing="0" w:line="252" w:lineRule="auto"/>
+        <w:ind w:left="0" w:leftChars="0" w:right="0" w:rightChars="0" w:firstLine="0"/>
         <w:jc w:val="left"/>
         <w:rPr>
           <w:rFonts w:hint="default" w:ascii="Helvetica" w:hAnsi="Helvetica" w:eastAsia="Helvetica" w:cs="Helvetica"/>
@@ -952,8 +1467,18 @@
     <w:p>
       <w:pPr>
         <w:pStyle w:val="3"/>
-      </w:pPr>
-      <w:r>
+        <w:keepNext/>
+        <w:spacing w:before="140" w:after="40"/>
+        <w:ind w:left="0" w:right="0" w:firstLine="0"/>
+        <w:jc w:val="left"/>
+      </w:pPr>
+      <w:r>
+        <w:rPr>
+          <w:rFonts w:ascii="Aptos" w:hAnsi="Aptos" w:eastAsia="Microsoft YaHei"/>
+          <w:b/>
+          <w:color w:val="2C5F7C"/>
+          <w:sz w:val="23"/>
+        </w:rPr>
         <w:t>3. 四个核心接口</w:t>
       </w:r>
     </w:p>
@@ -962,10 +1487,6 @@
         <w:keepNext w:val="0"/>
         <w:keepLines w:val="0"/>
         <w:widowControl/>
-        <w:numPr>
-          <w:ilvl w:val="0"/>
-          <w:numId w:val="0"/>
-        </w:numPr>
         <w:suppressLineNumbers w:val="0"/>
         <w:pBdr>
           <w:top w:val="none" w:color="auto" w:sz="0" w:space="0"/>
@@ -973,8 +1494,8 @@
           <w:bottom w:val="none" w:color="auto" w:sz="0" w:space="0"/>
           <w:right w:val="none" w:color="auto" w:sz="0" w:space="0"/>
         </w:pBdr>
-        <w:spacing w:before="0" w:beforeAutospacing="0" w:after="210" w:afterAutospacing="0"/>
-        <w:ind w:left="-360" w:leftChars="0" w:right="0" w:rightChars="0"/>
+        <w:spacing w:before="0" w:beforeAutospacing="0" w:after="60" w:afterAutospacing="0" w:line="259" w:lineRule="auto"/>
+        <w:ind w:left="0" w:leftChars="0" w:right="0" w:rightChars="0" w:firstLine="0"/>
         <w:jc w:val="left"/>
         <w:rPr>
           <w:rFonts w:hint="default" w:ascii="Helvetica" w:hAnsi="Helvetica" w:eastAsia="Helvetica" w:cs="Helvetica"/>
@@ -988,6 +1509,10 @@
         </w:rPr>
       </w:pPr>
       <w:r>
+        <w:rPr>
+          <w:rFonts w:ascii="Aptos" w:hAnsi="Aptos" w:eastAsia="Microsoft YaHei"/>
+          <w:sz w:val="21"/>
+        </w:rPr>
         <w:t>is_valid_message(message)：检查包头、总长度、4 位十进制长度、4 位十六进制 CRC、CRLF 结束符以及声明长度与实际数据段长度是否一致；再调用 CRC 校验。</w:t>
       </w:r>
     </w:p>
@@ -996,10 +1521,6 @@
         <w:keepNext w:val="0"/>
         <w:keepLines w:val="0"/>
         <w:widowControl/>
-        <w:numPr>
-          <w:ilvl w:val="0"/>
-          <w:numId w:val="0"/>
-        </w:numPr>
         <w:suppressLineNumbers w:val="0"/>
         <w:pBdr>
           <w:top w:val="none" w:color="auto" w:sz="0" w:space="0"/>
@@ -1007,8 +1528,8 @@
           <w:bottom w:val="none" w:color="auto" w:sz="0" w:space="0"/>
           <w:right w:val="none" w:color="auto" w:sz="0" w:space="0"/>
         </w:pBdr>
-        <w:spacing w:before="0" w:beforeAutospacing="0" w:after="210" w:afterAutospacing="0"/>
-        <w:ind w:left="-360" w:leftChars="0" w:right="0" w:rightChars="0"/>
+        <w:spacing w:before="0" w:beforeAutospacing="0" w:after="60" w:afterAutospacing="0" w:line="259" w:lineRule="auto"/>
+        <w:ind w:left="0" w:leftChars="0" w:right="0" w:rightChars="0" w:firstLine="0"/>
         <w:jc w:val="left"/>
         <w:rPr>
           <w:rFonts w:hint="default" w:ascii="Helvetica" w:hAnsi="Helvetica" w:eastAsia="Helvetica" w:cs="Helvetica"/>
@@ -1022,6 +1543,10 @@
         </w:rPr>
       </w:pPr>
       <w:r>
+        <w:rPr>
+          <w:rFonts w:ascii="Aptos" w:hAnsi="Aptos" w:eastAsia="Microsoft YaHei"/>
+          <w:sz w:val="21"/>
+        </w:rPr>
         <w:t>validate_crc(message)：从结构正确的报文中提取数据段和 CRC 字段，重算 CRC 并比较。格式错误应返回失败或抛出明确异常，不能默认为通过。</w:t>
       </w:r>
     </w:p>
@@ -1030,10 +1555,6 @@
         <w:keepNext w:val="0"/>
         <w:keepLines w:val="0"/>
         <w:widowControl/>
-        <w:numPr>
-          <w:ilvl w:val="0"/>
-          <w:numId w:val="0"/>
-        </w:numPr>
         <w:suppressLineNumbers w:val="0"/>
         <w:pBdr>
           <w:top w:val="none" w:color="auto" w:sz="0" w:space="0"/>
@@ -1041,8 +1562,8 @@
           <w:bottom w:val="none" w:color="auto" w:sz="0" w:space="0"/>
           <w:right w:val="none" w:color="auto" w:sz="0" w:space="0"/>
         </w:pBdr>
-        <w:spacing w:before="0" w:beforeAutospacing="0" w:after="210" w:afterAutospacing="0"/>
-        <w:ind w:left="-360" w:leftChars="0" w:right="0" w:rightChars="0"/>
+        <w:spacing w:before="0" w:beforeAutospacing="0" w:after="60" w:afterAutospacing="0" w:line="259" w:lineRule="auto"/>
+        <w:ind w:left="0" w:leftChars="0" w:right="0" w:rightChars="0" w:firstLine="0"/>
         <w:jc w:val="left"/>
         <w:rPr>
           <w:rFonts w:hint="default" w:ascii="Helvetica" w:hAnsi="Helvetica" w:eastAsia="Helvetica" w:cs="Helvetica"/>
@@ -1056,6 +1577,10 @@
         </w:rPr>
       </w:pPr>
       <w:r>
+        <w:rPr>
+          <w:rFonts w:ascii="Aptos" w:hAnsi="Aptos" w:eastAsia="Microsoft YaHei"/>
+          <w:sz w:val="21"/>
+        </w:rPr>
         <w:t>parse_data_segment(message)：按分号解析外层字段，但在 CP=&amp;&amp;...&amp;&amp; 的配对边界内保留其完整内容，不能把 CP 内部的分号当作外层分隔符；普通字段按第一个等号分成键和值，保留值中的后续等号。对缺少等号和重复键明确处理。</w:t>
       </w:r>
     </w:p>
@@ -1064,10 +1589,6 @@
         <w:keepNext w:val="0"/>
         <w:keepLines w:val="0"/>
         <w:widowControl/>
-        <w:numPr>
-          <w:ilvl w:val="0"/>
-          <w:numId w:val="0"/>
-        </w:numPr>
         <w:suppressLineNumbers w:val="0"/>
         <w:pBdr>
           <w:top w:val="none" w:color="auto" w:sz="0" w:space="0"/>
@@ -1075,8 +1596,8 @@
           <w:bottom w:val="none" w:color="auto" w:sz="0" w:space="0"/>
           <w:right w:val="none" w:color="auto" w:sz="0" w:space="0"/>
         </w:pBdr>
-        <w:spacing w:before="0" w:beforeAutospacing="0" w:after="210" w:afterAutospacing="0"/>
-        <w:ind w:left="-360" w:leftChars="0" w:right="0" w:rightChars="0"/>
+        <w:spacing w:before="0" w:beforeAutospacing="0" w:after="60" w:afterAutospacing="0" w:line="259" w:lineRule="auto"/>
+        <w:ind w:left="0" w:leftChars="0" w:right="0" w:rightChars="0" w:firstLine="0"/>
         <w:jc w:val="left"/>
         <w:rPr>
           <w:rFonts w:hint="default" w:ascii="Helvetica" w:hAnsi="Helvetica" w:eastAsia="Helvetica" w:cs="Helvetica"/>
@@ -1090,6 +1611,10 @@
         </w:rPr>
       </w:pPr>
       <w:r>
+        <w:rPr>
+          <w:rFonts w:ascii="Aptos" w:hAnsi="Aptos" w:eastAsia="Microsoft YaHei"/>
+          <w:sz w:val="21"/>
+        </w:rPr>
         <w:t>extract_monitoring_data(message)：从 CP=&amp;&amp;...&amp;&amp; 中取出数据体，按项目分号和同一项目内的逗号解析监测项，再识别形如 w01001-Avg=7.5 的键，将因子编码、数据类型和值组织为结构化结果。未匹配的普通参数不误识别为监测因子。</w:t>
       </w:r>
     </w:p>
@@ -1098,10 +1623,6 @@
         <w:keepNext w:val="0"/>
         <w:keepLines w:val="0"/>
         <w:widowControl/>
-        <w:numPr>
-          <w:ilvl w:val="0"/>
-          <w:numId w:val="0"/>
-        </w:numPr>
         <w:suppressLineNumbers w:val="0"/>
         <w:pBdr>
           <w:top w:val="none" w:color="auto" w:sz="0" w:space="0"/>
@@ -1109,8 +1630,8 @@
           <w:bottom w:val="none" w:color="auto" w:sz="0" w:space="0"/>
           <w:right w:val="none" w:color="auto" w:sz="0" w:space="0"/>
         </w:pBdr>
-        <w:spacing w:before="0" w:beforeAutospacing="0" w:after="210" w:afterAutospacing="0"/>
-        <w:ind w:left="-360" w:leftChars="0" w:right="0" w:rightChars="0"/>
+        <w:spacing w:before="0" w:beforeAutospacing="0" w:after="60" w:afterAutospacing="0" w:line="259" w:lineRule="auto"/>
+        <w:ind w:left="0" w:leftChars="0" w:right="0" w:rightChars="0" w:firstLine="0"/>
         <w:jc w:val="left"/>
         <w:rPr>
           <w:rFonts w:hint="default" w:ascii="Helvetica" w:hAnsi="Helvetica" w:eastAsia="Helvetica" w:cs="Helvetica"/>
@@ -1124,6 +1645,10 @@
         </w:rPr>
       </w:pPr>
       <w:r>
+        <w:rPr>
+          <w:rFonts w:ascii="Aptos" w:hAnsi="Aptos" w:eastAsia="Microsoft YaHei"/>
+          <w:sz w:val="21"/>
+        </w:rPr>
         <w:t>数据段示例：QN=20160801085857223;ST=32;CN=2061;PW=123456;MN=010000A8900016F000169DC0;Flag=5;CP=&amp;&amp;DataTime=20160801080000;w01001-Avg=7.5;w01018-Avg=40.1&amp;&amp;</w:t>
       </w:r>
     </w:p>
@@ -1132,10 +1657,6 @@
         <w:keepNext w:val="0"/>
         <w:keepLines w:val="0"/>
         <w:widowControl/>
-        <w:numPr>
-          <w:ilvl w:val="0"/>
-          <w:numId w:val="0"/>
-        </w:numPr>
         <w:suppressLineNumbers w:val="0"/>
         <w:pBdr>
           <w:top w:val="none" w:color="auto" w:sz="0" w:space="0"/>
@@ -1143,8 +1664,8 @@
           <w:bottom w:val="none" w:color="auto" w:sz="0" w:space="0"/>
           <w:right w:val="none" w:color="auto" w:sz="0" w:space="0"/>
         </w:pBdr>
-        <w:spacing w:before="0" w:beforeAutospacing="0" w:after="210" w:afterAutospacing="0"/>
-        <w:ind w:left="-360" w:leftChars="0" w:right="0" w:rightChars="0"/>
+        <w:spacing w:before="0" w:beforeAutospacing="0" w:after="60" w:afterAutospacing="0" w:line="259" w:lineRule="auto"/>
+        <w:ind w:left="0" w:leftChars="0" w:right="0" w:rightChars="0" w:firstLine="0"/>
         <w:jc w:val="left"/>
         <w:rPr>
           <w:rFonts w:hint="default" w:ascii="Helvetica" w:hAnsi="Helvetica" w:eastAsia="Helvetica" w:cs="Helvetica"/>
@@ -1158,14 +1679,28 @@
         </w:rPr>
       </w:pPr>
       <w:r>
+        <w:rPr>
+          <w:rFonts w:ascii="Aptos" w:hAnsi="Aptos" w:eastAsia="Microsoft YaHei"/>
+          <w:sz w:val="21"/>
+        </w:rPr>
         <w:t>解析要点：外层结果保留 QN、ST、CN、PW、MN、Flag 和完整 CP 字符串；监测项提取结果为 [(w01001, Avg, 7.5), (w01018, Avg, 40.1)]。此处为数据段解析示例，不代表完整帧校验结果。</w:t>
       </w:r>
     </w:p>
     <w:p>
       <w:pPr>
         <w:pStyle w:val="3"/>
-      </w:pPr>
-      <w:r>
+        <w:keepNext/>
+        <w:spacing w:before="140" w:after="40"/>
+        <w:ind w:left="0" w:right="0" w:firstLine="0"/>
+        <w:jc w:val="left"/>
+      </w:pPr>
+      <w:r>
+        <w:rPr>
+          <w:rFonts w:ascii="Aptos" w:hAnsi="Aptos" w:eastAsia="Microsoft YaHei"/>
+          <w:b/>
+          <w:color w:val="2C5F7C"/>
+          <w:sz w:val="23"/>
+        </w:rPr>
         <w:t>4. 检查用例设计</w:t>
       </w:r>
     </w:p>
@@ -1174,10 +1709,6 @@
         <w:keepNext w:val="0"/>
         <w:keepLines w:val="0"/>
         <w:widowControl/>
-        <w:numPr>
-          <w:ilvl w:val="0"/>
-          <w:numId w:val="0"/>
-        </w:numPr>
         <w:suppressLineNumbers w:val="0"/>
         <w:pBdr>
           <w:top w:val="none" w:color="auto" w:sz="0" w:space="0"/>
@@ -1185,8 +1716,8 @@
           <w:bottom w:val="none" w:color="auto" w:sz="0" w:space="0"/>
           <w:right w:val="none" w:color="auto" w:sz="0" w:space="0"/>
         </w:pBdr>
-        <w:spacing w:before="0" w:beforeAutospacing="0" w:after="210" w:afterAutospacing="0"/>
-        <w:ind w:left="-360" w:leftChars="0" w:right="0" w:rightChars="0"/>
+        <w:spacing w:before="0" w:beforeAutospacing="0" w:after="60" w:afterAutospacing="0" w:line="259" w:lineRule="auto"/>
+        <w:ind w:left="0" w:leftChars="0" w:right="0" w:rightChars="0" w:firstLine="0"/>
         <w:jc w:val="left"/>
         <w:rPr>
           <w:rFonts w:hint="default" w:ascii="Helvetica" w:hAnsi="Helvetica" w:eastAsia="Helvetica" w:cs="Helvetica"/>
@@ -1200,6 +1731,10 @@
         </w:rPr>
       </w:pPr>
       <w:r>
+        <w:rPr>
+          <w:rFonts w:ascii="Aptos" w:hAnsi="Aptos" w:eastAsia="Microsoft YaHei"/>
+          <w:sz w:val="21"/>
+        </w:rPr>
         <w:t>检查设计覆盖合法路径和边界错误。下列输入变化与预期现象可作为回归检查依据。</w:t>
       </w:r>
     </w:p>
@@ -1208,6 +1743,7 @@
         <w:tblStyle w:val="9"/>
         <w:tblW w:type="auto" w:w="0"/>
         <w:jc w:val="center"/>
+        <w:tblLayout w:type="fixed"/>
         <w:tblLook w:firstColumn="1" w:firstRow="1" w:lastColumn="0" w:lastRow="0" w:noHBand="0" w:noVBand="1" w:val="04A0"/>
       </w:tblPr>
       <w:tblGrid>
@@ -1216,15 +1752,41 @@
         <w:gridCol w:w="2769"/>
       </w:tblGrid>
       <w:tr>
+        <w:trPr>
+          <w:tblHeader/>
+          <w:cantSplit/>
+        </w:trPr>
         <w:tc>
           <w:tcPr>
-            <w:tcW w:type="dxa" w:w="2769"/>
+            <w:tcW w:type="dxa" w:w="2131"/>
             <w:vAlign w:val="center"/>
+            <w:shd w:fill="1F4E78"/>
+            <w:tcMar>
+              <w:top w:w="100" w:type="dxa"/>
+              <w:bottom w:w="100" w:type="dxa"/>
+              <w:left w:w="110" w:type="dxa"/>
+              <w:right w:w="110" w:type="dxa"/>
+            </w:tcMar>
+            <w:tcBorders>
+              <w:top w:val="single" w:sz="5" w:color="D6E0EA"/>
+              <w:left w:val="single" w:sz="5" w:color="D6E0EA"/>
+              <w:bottom w:val="single" w:sz="5" w:color="D6E0EA"/>
+              <w:right w:val="single" w:sz="5" w:color="D6E0EA"/>
+              <w:insideH w:val="single" w:sz="5" w:color="D6E0EA"/>
+              <w:insideV w:val="single" w:sz="5" w:color="D6E0EA"/>
+            </w:tcBorders>
           </w:tcPr>
           <w:p>
+            <w:pPr>
+              <w:spacing w:before="20" w:after="20"/>
+              <w:jc w:val="center"/>
+            </w:pPr>
             <w:r>
               <w:rPr>
+                <w:rFonts w:ascii="Aptos" w:hAnsi="Aptos" w:eastAsia="Microsoft YaHei"/>
                 <w:b/>
+                <w:color w:val="FFFFFF"/>
+                <w:sz w:val="19"/>
               </w:rPr>
               <w:t>场景</w:t>
             </w:r>
@@ -1232,13 +1794,35 @@
         </w:tc>
         <w:tc>
           <w:tcPr>
-            <w:tcW w:type="dxa" w:w="2769"/>
+            <w:tcW w:type="dxa" w:w="2880"/>
             <w:vAlign w:val="center"/>
+            <w:shd w:fill="1F4E78"/>
+            <w:tcMar>
+              <w:top w:w="100" w:type="dxa"/>
+              <w:bottom w:w="100" w:type="dxa"/>
+              <w:left w:w="110" w:type="dxa"/>
+              <w:right w:w="110" w:type="dxa"/>
+            </w:tcMar>
+            <w:tcBorders>
+              <w:top w:val="single" w:sz="5" w:color="D6E0EA"/>
+              <w:left w:val="single" w:sz="5" w:color="D6E0EA"/>
+              <w:bottom w:val="single" w:sz="5" w:color="D6E0EA"/>
+              <w:right w:val="single" w:sz="5" w:color="D6E0EA"/>
+              <w:insideH w:val="single" w:sz="5" w:color="D6E0EA"/>
+              <w:insideV w:val="single" w:sz="5" w:color="D6E0EA"/>
+            </w:tcBorders>
           </w:tcPr>
           <w:p>
+            <w:pPr>
+              <w:spacing w:before="20" w:after="20"/>
+              <w:jc w:val="center"/>
+            </w:pPr>
             <w:r>
               <w:rPr>
+                <w:rFonts w:ascii="Aptos" w:hAnsi="Aptos" w:eastAsia="Microsoft YaHei"/>
                 <w:b/>
+                <w:color w:val="FFFFFF"/>
+                <w:sz w:val="19"/>
               </w:rPr>
               <w:t>输入变化</w:t>
             </w:r>
@@ -1246,13 +1830,35 @@
         </w:tc>
         <w:tc>
           <w:tcPr>
-            <w:tcW w:type="dxa" w:w="2769"/>
+            <w:tcW w:type="dxa" w:w="3298"/>
             <w:vAlign w:val="center"/>
+            <w:shd w:fill="1F4E78"/>
+            <w:tcMar>
+              <w:top w:w="100" w:type="dxa"/>
+              <w:bottom w:w="100" w:type="dxa"/>
+              <w:left w:w="110" w:type="dxa"/>
+              <w:right w:w="110" w:type="dxa"/>
+            </w:tcMar>
+            <w:tcBorders>
+              <w:top w:val="single" w:sz="5" w:color="D6E0EA"/>
+              <w:left w:val="single" w:sz="5" w:color="D6E0EA"/>
+              <w:bottom w:val="single" w:sz="5" w:color="D6E0EA"/>
+              <w:right w:val="single" w:sz="5" w:color="D6E0EA"/>
+              <w:insideH w:val="single" w:sz="5" w:color="D6E0EA"/>
+              <w:insideV w:val="single" w:sz="5" w:color="D6E0EA"/>
+            </w:tcBorders>
           </w:tcPr>
           <w:p>
+            <w:pPr>
+              <w:spacing w:before="20" w:after="20"/>
+              <w:jc w:val="center"/>
+            </w:pPr>
             <w:r>
               <w:rPr>
+                <w:rFonts w:ascii="Aptos" w:hAnsi="Aptos" w:eastAsia="Microsoft YaHei"/>
                 <w:b/>
+                <w:color w:val="FFFFFF"/>
+                <w:sz w:val="19"/>
               </w:rPr>
               <w:t>预期结果</w:t>
             </w:r>
@@ -1260,14 +1866,38 @@
         </w:tc>
       </w:tr>
       <w:tr>
+        <w:trPr>
+          <w:cantSplit/>
+        </w:trPr>
         <w:tc>
           <w:tcPr>
-            <w:tcW w:type="dxa" w:w="2769"/>
+            <w:tcW w:type="dxa" w:w="2131"/>
             <w:vAlign w:val="center"/>
+            <w:tcMar>
+              <w:top w:w="95" w:type="dxa"/>
+              <w:bottom w:w="95" w:type="dxa"/>
+              <w:left w:w="110" w:type="dxa"/>
+              <w:right w:w="110" w:type="dxa"/>
+            </w:tcMar>
+            <w:shd w:fill="F3F7FA"/>
+            <w:tcBorders>
+              <w:top w:val="single" w:sz="5" w:color="D6E0EA"/>
+              <w:left w:val="single" w:sz="5" w:color="D6E0EA"/>
+              <w:bottom w:val="single" w:sz="5" w:color="D6E0EA"/>
+              <w:right w:val="single" w:sz="5" w:color="D6E0EA"/>
+              <w:insideH w:val="single" w:sz="5" w:color="D6E0EA"/>
+              <w:insideV w:val="single" w:sz="5" w:color="D6E0EA"/>
+            </w:tcBorders>
           </w:tcPr>
           <w:p>
+            <w:pPr>
+              <w:spacing w:before="0" w:after="0" w:line="240" w:lineRule="auto"/>
+              <w:jc w:val="left"/>
+            </w:pPr>
             <w:r>
               <w:rPr>
+                <w:rFonts w:ascii="Aptos" w:hAnsi="Aptos" w:eastAsia="Microsoft YaHei"/>
+                <w:color w:val="243B53"/>
                 <w:sz w:val="18"/>
               </w:rPr>
               <w:t>HJ212-2017附录A样例帧</w:t>
@@ -1276,12 +1906,33 @@
         </w:tc>
         <w:tc>
           <w:tcPr>
-            <w:tcW w:type="dxa" w:w="2769"/>
+            <w:tcW w:type="dxa" w:w="2880"/>
             <w:vAlign w:val="center"/>
+            <w:tcMar>
+              <w:top w:w="95" w:type="dxa"/>
+              <w:bottom w:w="95" w:type="dxa"/>
+              <w:left w:w="110" w:type="dxa"/>
+              <w:right w:w="110" w:type="dxa"/>
+            </w:tcMar>
+            <w:shd w:fill="F3F7FA"/>
+            <w:tcBorders>
+              <w:top w:val="single" w:sz="5" w:color="D6E0EA"/>
+              <w:left w:val="single" w:sz="5" w:color="D6E0EA"/>
+              <w:bottom w:val="single" w:sz="5" w:color="D6E0EA"/>
+              <w:right w:val="single" w:sz="5" w:color="D6E0EA"/>
+              <w:insideH w:val="single" w:sz="5" w:color="D6E0EA"/>
+              <w:insideV w:val="single" w:sz="5" w:color="D6E0EA"/>
+            </w:tcBorders>
           </w:tcPr>
           <w:p>
+            <w:pPr>
+              <w:spacing w:before="0" w:after="0" w:line="240" w:lineRule="auto"/>
+              <w:jc w:val="left"/>
+            </w:pPr>
             <w:r>
               <w:rPr>
+                <w:rFonts w:ascii="Aptos" w:hAnsi="Aptos" w:eastAsia="Microsoft YaHei"/>
+                <w:color w:val="243B53"/>
                 <w:sz w:val="18"/>
               </w:rPr>
               <w:t>标准样例长度0101、CRC=1C80、CRLF</w:t>
@@ -1290,12 +1941,33 @@
         </w:tc>
         <w:tc>
           <w:tcPr>
-            <w:tcW w:type="dxa" w:w="2769"/>
+            <w:tcW w:type="dxa" w:w="3298"/>
             <w:vAlign w:val="center"/>
+            <w:tcMar>
+              <w:top w:w="95" w:type="dxa"/>
+              <w:bottom w:w="95" w:type="dxa"/>
+              <w:left w:w="110" w:type="dxa"/>
+              <w:right w:w="110" w:type="dxa"/>
+            </w:tcMar>
+            <w:shd w:fill="F3F7FA"/>
+            <w:tcBorders>
+              <w:top w:val="single" w:sz="5" w:color="D6E0EA"/>
+              <w:left w:val="single" w:sz="5" w:color="D6E0EA"/>
+              <w:bottom w:val="single" w:sz="5" w:color="D6E0EA"/>
+              <w:right w:val="single" w:sz="5" w:color="D6E0EA"/>
+              <w:insideH w:val="single" w:sz="5" w:color="D6E0EA"/>
+              <w:insideV w:val="single" w:sz="5" w:color="D6E0EA"/>
+            </w:tcBorders>
           </w:tcPr>
           <w:p>
+            <w:pPr>
+              <w:spacing w:before="0" w:after="0" w:line="240" w:lineRule="auto"/>
+              <w:jc w:val="left"/>
+            </w:pPr>
             <w:r>
               <w:rPr>
+                <w:rFonts w:ascii="Aptos" w:hAnsi="Aptos" w:eastAsia="Microsoft YaHei"/>
+                <w:color w:val="243B53"/>
                 <w:sz w:val="18"/>
               </w:rPr>
               <w:t>格式和CRC通过；校验码应为1C80，并解析返回数据段字段</w:t>
@@ -1304,14 +1976,37 @@
         </w:tc>
       </w:tr>
       <w:tr>
+        <w:trPr>
+          <w:cantSplit/>
+        </w:trPr>
         <w:tc>
           <w:tcPr>
-            <w:tcW w:type="dxa" w:w="2769"/>
+            <w:tcW w:type="dxa" w:w="2131"/>
             <w:vAlign w:val="center"/>
+            <w:tcMar>
+              <w:top w:w="95" w:type="dxa"/>
+              <w:bottom w:w="95" w:type="dxa"/>
+              <w:left w:w="110" w:type="dxa"/>
+              <w:right w:w="110" w:type="dxa"/>
+            </w:tcMar>
+            <w:tcBorders>
+              <w:top w:val="single" w:sz="5" w:color="D6E0EA"/>
+              <w:left w:val="single" w:sz="5" w:color="D6E0EA"/>
+              <w:bottom w:val="single" w:sz="5" w:color="D6E0EA"/>
+              <w:right w:val="single" w:sz="5" w:color="D6E0EA"/>
+              <w:insideH w:val="single" w:sz="5" w:color="D6E0EA"/>
+              <w:insideV w:val="single" w:sz="5" w:color="D6E0EA"/>
+            </w:tcBorders>
           </w:tcPr>
           <w:p>
+            <w:pPr>
+              <w:spacing w:before="0" w:after="0" w:line="240" w:lineRule="auto"/>
+              <w:jc w:val="left"/>
+            </w:pPr>
             <w:r>
               <w:rPr>
+                <w:rFonts w:ascii="Aptos" w:hAnsi="Aptos" w:eastAsia="Microsoft YaHei"/>
+                <w:color w:val="243B53"/>
                 <w:sz w:val="18"/>
               </w:rPr>
               <w:t>长度不符</w:t>
@@ -1320,12 +2015,32 @@
         </w:tc>
         <w:tc>
           <w:tcPr>
-            <w:tcW w:type="dxa" w:w="2769"/>
+            <w:tcW w:type="dxa" w:w="2880"/>
             <w:vAlign w:val="center"/>
+            <w:tcMar>
+              <w:top w:w="95" w:type="dxa"/>
+              <w:bottom w:w="95" w:type="dxa"/>
+              <w:left w:w="110" w:type="dxa"/>
+              <w:right w:w="110" w:type="dxa"/>
+            </w:tcMar>
+            <w:tcBorders>
+              <w:top w:val="single" w:sz="5" w:color="D6E0EA"/>
+              <w:left w:val="single" w:sz="5" w:color="D6E0EA"/>
+              <w:bottom w:val="single" w:sz="5" w:color="D6E0EA"/>
+              <w:right w:val="single" w:sz="5" w:color="D6E0EA"/>
+              <w:insideH w:val="single" w:sz="5" w:color="D6E0EA"/>
+              <w:insideV w:val="single" w:sz="5" w:color="D6E0EA"/>
+            </w:tcBorders>
           </w:tcPr>
           <w:p>
+            <w:pPr>
+              <w:spacing w:before="0" w:after="0" w:line="240" w:lineRule="auto"/>
+              <w:jc w:val="left"/>
+            </w:pPr>
             <w:r>
               <w:rPr>
+                <w:rFonts w:ascii="Aptos" w:hAnsi="Aptos" w:eastAsia="Microsoft YaHei"/>
+                <w:color w:val="243B53"/>
                 <w:sz w:val="18"/>
               </w:rPr>
               <w:t>修改4位长度但不改正文</w:t>
@@ -1334,12 +2049,32 @@
         </w:tc>
         <w:tc>
           <w:tcPr>
-            <w:tcW w:type="dxa" w:w="2769"/>
+            <w:tcW w:type="dxa" w:w="3298"/>
             <w:vAlign w:val="center"/>
+            <w:tcMar>
+              <w:top w:w="95" w:type="dxa"/>
+              <w:bottom w:w="95" w:type="dxa"/>
+              <w:left w:w="110" w:type="dxa"/>
+              <w:right w:w="110" w:type="dxa"/>
+            </w:tcMar>
+            <w:tcBorders>
+              <w:top w:val="single" w:sz="5" w:color="D6E0EA"/>
+              <w:left w:val="single" w:sz="5" w:color="D6E0EA"/>
+              <w:bottom w:val="single" w:sz="5" w:color="D6E0EA"/>
+              <w:right w:val="single" w:sz="5" w:color="D6E0EA"/>
+              <w:insideH w:val="single" w:sz="5" w:color="D6E0EA"/>
+              <w:insideV w:val="single" w:sz="5" w:color="D6E0EA"/>
+            </w:tcBorders>
           </w:tcPr>
           <w:p>
+            <w:pPr>
+              <w:spacing w:before="0" w:after="0" w:line="240" w:lineRule="auto"/>
+              <w:jc w:val="left"/>
+            </w:pPr>
             <w:r>
               <w:rPr>
+                <w:rFonts w:ascii="Aptos" w:hAnsi="Aptos" w:eastAsia="Microsoft YaHei"/>
+                <w:color w:val="243B53"/>
                 <w:sz w:val="18"/>
               </w:rPr>
               <w:t>格式检查失败，不解析业务字段</w:t>
@@ -1348,14 +2083,38 @@
         </w:tc>
       </w:tr>
       <w:tr>
+        <w:trPr>
+          <w:cantSplit/>
+        </w:trPr>
         <w:tc>
           <w:tcPr>
-            <w:tcW w:type="dxa" w:w="2769"/>
+            <w:tcW w:type="dxa" w:w="2131"/>
             <w:vAlign w:val="center"/>
+            <w:tcMar>
+              <w:top w:w="95" w:type="dxa"/>
+              <w:bottom w:w="95" w:type="dxa"/>
+              <w:left w:w="110" w:type="dxa"/>
+              <w:right w:w="110" w:type="dxa"/>
+            </w:tcMar>
+            <w:shd w:fill="F3F7FA"/>
+            <w:tcBorders>
+              <w:top w:val="single" w:sz="5" w:color="D6E0EA"/>
+              <w:left w:val="single" w:sz="5" w:color="D6E0EA"/>
+              <w:bottom w:val="single" w:sz="5" w:color="D6E0EA"/>
+              <w:right w:val="single" w:sz="5" w:color="D6E0EA"/>
+              <w:insideH w:val="single" w:sz="5" w:color="D6E0EA"/>
+              <w:insideV w:val="single" w:sz="5" w:color="D6E0EA"/>
+            </w:tcBorders>
           </w:tcPr>
           <w:p>
+            <w:pPr>
+              <w:spacing w:before="0" w:after="0" w:line="240" w:lineRule="auto"/>
+              <w:jc w:val="left"/>
+            </w:pPr>
             <w:r>
               <w:rPr>
+                <w:rFonts w:ascii="Aptos" w:hAnsi="Aptos" w:eastAsia="Microsoft YaHei"/>
+                <w:color w:val="243B53"/>
                 <w:sz w:val="18"/>
               </w:rPr>
               <w:t>CRC错误</w:t>
@@ -1364,12 +2123,33 @@
         </w:tc>
         <w:tc>
           <w:tcPr>
-            <w:tcW w:type="dxa" w:w="2769"/>
+            <w:tcW w:type="dxa" w:w="2880"/>
             <w:vAlign w:val="center"/>
+            <w:tcMar>
+              <w:top w:w="95" w:type="dxa"/>
+              <w:bottom w:w="95" w:type="dxa"/>
+              <w:left w:w="110" w:type="dxa"/>
+              <w:right w:w="110" w:type="dxa"/>
+            </w:tcMar>
+            <w:shd w:fill="F3F7FA"/>
+            <w:tcBorders>
+              <w:top w:val="single" w:sz="5" w:color="D6E0EA"/>
+              <w:left w:val="single" w:sz="5" w:color="D6E0EA"/>
+              <w:bottom w:val="single" w:sz="5" w:color="D6E0EA"/>
+              <w:right w:val="single" w:sz="5" w:color="D6E0EA"/>
+              <w:insideH w:val="single" w:sz="5" w:color="D6E0EA"/>
+              <w:insideV w:val="single" w:sz="5" w:color="D6E0EA"/>
+            </w:tcBorders>
           </w:tcPr>
           <w:p>
+            <w:pPr>
+              <w:spacing w:before="0" w:after="0" w:line="240" w:lineRule="auto"/>
+              <w:jc w:val="left"/>
+            </w:pPr>
             <w:r>
               <w:rPr>
+                <w:rFonts w:ascii="Aptos" w:hAnsi="Aptos" w:eastAsia="Microsoft YaHei"/>
+                <w:color w:val="243B53"/>
                 <w:sz w:val="18"/>
               </w:rPr>
               <w:t>翻转CRC字段一位</w:t>
@@ -1378,12 +2158,33 @@
         </w:tc>
         <w:tc>
           <w:tcPr>
-            <w:tcW w:type="dxa" w:w="2769"/>
+            <w:tcW w:type="dxa" w:w="3298"/>
             <w:vAlign w:val="center"/>
+            <w:tcMar>
+              <w:top w:w="95" w:type="dxa"/>
+              <w:bottom w:w="95" w:type="dxa"/>
+              <w:left w:w="110" w:type="dxa"/>
+              <w:right w:w="110" w:type="dxa"/>
+            </w:tcMar>
+            <w:shd w:fill="F3F7FA"/>
+            <w:tcBorders>
+              <w:top w:val="single" w:sz="5" w:color="D6E0EA"/>
+              <w:left w:val="single" w:sz="5" w:color="D6E0EA"/>
+              <w:bottom w:val="single" w:sz="5" w:color="D6E0EA"/>
+              <w:right w:val="single" w:sz="5" w:color="D6E0EA"/>
+              <w:insideH w:val="single" w:sz="5" w:color="D6E0EA"/>
+              <w:insideV w:val="single" w:sz="5" w:color="D6E0EA"/>
+            </w:tcBorders>
           </w:tcPr>
           <w:p>
+            <w:pPr>
+              <w:spacing w:before="0" w:after="0" w:line="240" w:lineRule="auto"/>
+              <w:jc w:val="left"/>
+            </w:pPr>
             <w:r>
               <w:rPr>
+                <w:rFonts w:ascii="Aptos" w:hAnsi="Aptos" w:eastAsia="Microsoft YaHei"/>
+                <w:color w:val="243B53"/>
                 <w:sz w:val="18"/>
               </w:rPr>
               <w:t>格式可识别但CRC校验失败</w:t>
@@ -1392,14 +2193,37 @@
         </w:tc>
       </w:tr>
       <w:tr>
+        <w:trPr>
+          <w:cantSplit/>
+        </w:trPr>
         <w:tc>
           <w:tcPr>
-            <w:tcW w:type="dxa" w:w="2769"/>
+            <w:tcW w:type="dxa" w:w="2131"/>
             <w:vAlign w:val="center"/>
+            <w:tcMar>
+              <w:top w:w="95" w:type="dxa"/>
+              <w:bottom w:w="95" w:type="dxa"/>
+              <w:left w:w="110" w:type="dxa"/>
+              <w:right w:w="110" w:type="dxa"/>
+            </w:tcMar>
+            <w:tcBorders>
+              <w:top w:val="single" w:sz="5" w:color="D6E0EA"/>
+              <w:left w:val="single" w:sz="5" w:color="D6E0EA"/>
+              <w:bottom w:val="single" w:sz="5" w:color="D6E0EA"/>
+              <w:right w:val="single" w:sz="5" w:color="D6E0EA"/>
+              <w:insideH w:val="single" w:sz="5" w:color="D6E0EA"/>
+              <w:insideV w:val="single" w:sz="5" w:color="D6E0EA"/>
+            </w:tcBorders>
           </w:tcPr>
           <w:p>
+            <w:pPr>
+              <w:spacing w:before="0" w:after="0" w:line="240" w:lineRule="auto"/>
+              <w:jc w:val="left"/>
+            </w:pPr>
             <w:r>
               <w:rPr>
+                <w:rFonts w:ascii="Aptos" w:hAnsi="Aptos" w:eastAsia="Microsoft YaHei"/>
+                <w:color w:val="243B53"/>
                 <w:sz w:val="18"/>
               </w:rPr>
               <w:t>结束符缺失</w:t>
@@ -1408,12 +2232,32 @@
         </w:tc>
         <w:tc>
           <w:tcPr>
-            <w:tcW w:type="dxa" w:w="2769"/>
+            <w:tcW w:type="dxa" w:w="2880"/>
             <w:vAlign w:val="center"/>
+            <w:tcMar>
+              <w:top w:w="95" w:type="dxa"/>
+              <w:bottom w:w="95" w:type="dxa"/>
+              <w:left w:w="110" w:type="dxa"/>
+              <w:right w:w="110" w:type="dxa"/>
+            </w:tcMar>
+            <w:tcBorders>
+              <w:top w:val="single" w:sz="5" w:color="D6E0EA"/>
+              <w:left w:val="single" w:sz="5" w:color="D6E0EA"/>
+              <w:bottom w:val="single" w:sz="5" w:color="D6E0EA"/>
+              <w:right w:val="single" w:sz="5" w:color="D6E0EA"/>
+              <w:insideH w:val="single" w:sz="5" w:color="D6E0EA"/>
+              <w:insideV w:val="single" w:sz="5" w:color="D6E0EA"/>
+            </w:tcBorders>
           </w:tcPr>
           <w:p>
+            <w:pPr>
+              <w:spacing w:before="0" w:after="0" w:line="240" w:lineRule="auto"/>
+              <w:jc w:val="left"/>
+            </w:pPr>
             <w:r>
               <w:rPr>
+                <w:rFonts w:ascii="Aptos" w:hAnsi="Aptos" w:eastAsia="Microsoft YaHei"/>
+                <w:color w:val="243B53"/>
                 <w:sz w:val="18"/>
               </w:rPr>
               <w:t>删除CRLF</w:t>
@@ -1422,12 +2266,32 @@
         </w:tc>
         <w:tc>
           <w:tcPr>
-            <w:tcW w:type="dxa" w:w="2769"/>
+            <w:tcW w:type="dxa" w:w="3298"/>
             <w:vAlign w:val="center"/>
+            <w:tcMar>
+              <w:top w:w="95" w:type="dxa"/>
+              <w:bottom w:w="95" w:type="dxa"/>
+              <w:left w:w="110" w:type="dxa"/>
+              <w:right w:w="110" w:type="dxa"/>
+            </w:tcMar>
+            <w:tcBorders>
+              <w:top w:val="single" w:sz="5" w:color="D6E0EA"/>
+              <w:left w:val="single" w:sz="5" w:color="D6E0EA"/>
+              <w:bottom w:val="single" w:sz="5" w:color="D6E0EA"/>
+              <w:right w:val="single" w:sz="5" w:color="D6E0EA"/>
+              <w:insideH w:val="single" w:sz="5" w:color="D6E0EA"/>
+              <w:insideV w:val="single" w:sz="5" w:color="D6E0EA"/>
+            </w:tcBorders>
           </w:tcPr>
           <w:p>
+            <w:pPr>
+              <w:spacing w:before="0" w:after="0" w:line="240" w:lineRule="auto"/>
+              <w:jc w:val="left"/>
+            </w:pPr>
             <w:r>
               <w:rPr>
+                <w:rFonts w:ascii="Aptos" w:hAnsi="Aptos" w:eastAsia="Microsoft YaHei"/>
+                <w:color w:val="243B53"/>
                 <w:sz w:val="18"/>
               </w:rPr>
               <w:t>完整报文校验失败</w:t>
@@ -1436,14 +2300,38 @@
         </w:tc>
       </w:tr>
       <w:tr>
+        <w:trPr>
+          <w:cantSplit/>
+        </w:trPr>
         <w:tc>
           <w:tcPr>
-            <w:tcW w:type="dxa" w:w="2769"/>
+            <w:tcW w:type="dxa" w:w="2131"/>
             <w:vAlign w:val="center"/>
+            <w:tcMar>
+              <w:top w:w="95" w:type="dxa"/>
+              <w:bottom w:w="95" w:type="dxa"/>
+              <w:left w:w="110" w:type="dxa"/>
+              <w:right w:w="110" w:type="dxa"/>
+            </w:tcMar>
+            <w:shd w:fill="F3F7FA"/>
+            <w:tcBorders>
+              <w:top w:val="single" w:sz="5" w:color="D6E0EA"/>
+              <w:left w:val="single" w:sz="5" w:color="D6E0EA"/>
+              <w:bottom w:val="single" w:sz="5" w:color="D6E0EA"/>
+              <w:right w:val="single" w:sz="5" w:color="D6E0EA"/>
+              <w:insideH w:val="single" w:sz="5" w:color="D6E0EA"/>
+              <w:insideV w:val="single" w:sz="5" w:color="D6E0EA"/>
+            </w:tcBorders>
           </w:tcPr>
           <w:p>
+            <w:pPr>
+              <w:spacing w:before="0" w:after="0" w:line="240" w:lineRule="auto"/>
+              <w:jc w:val="left"/>
+            </w:pPr>
             <w:r>
               <w:rPr>
+                <w:rFonts w:ascii="Aptos" w:hAnsi="Aptos" w:eastAsia="Microsoft YaHei"/>
+                <w:color w:val="243B53"/>
                 <w:sz w:val="18"/>
               </w:rPr>
               <w:t>非法字段</w:t>
@@ -1452,12 +2340,33 @@
         </w:tc>
         <w:tc>
           <w:tcPr>
-            <w:tcW w:type="dxa" w:w="2769"/>
+            <w:tcW w:type="dxa" w:w="2880"/>
             <w:vAlign w:val="center"/>
+            <w:tcMar>
+              <w:top w:w="95" w:type="dxa"/>
+              <w:bottom w:w="95" w:type="dxa"/>
+              <w:left w:w="110" w:type="dxa"/>
+              <w:right w:w="110" w:type="dxa"/>
+            </w:tcMar>
+            <w:shd w:fill="F3F7FA"/>
+            <w:tcBorders>
+              <w:top w:val="single" w:sz="5" w:color="D6E0EA"/>
+              <w:left w:val="single" w:sz="5" w:color="D6E0EA"/>
+              <w:bottom w:val="single" w:sz="5" w:color="D6E0EA"/>
+              <w:right w:val="single" w:sz="5" w:color="D6E0EA"/>
+              <w:insideH w:val="single" w:sz="5" w:color="D6E0EA"/>
+              <w:insideV w:val="single" w:sz="5" w:color="D6E0EA"/>
+            </w:tcBorders>
           </w:tcPr>
           <w:p>
+            <w:pPr>
+              <w:spacing w:before="0" w:after="0" w:line="240" w:lineRule="auto"/>
+              <w:jc w:val="left"/>
+            </w:pPr>
             <w:r>
               <w:rPr>
+                <w:rFonts w:ascii="Aptos" w:hAnsi="Aptos" w:eastAsia="Microsoft YaHei"/>
+                <w:color w:val="243B53"/>
                 <w:sz w:val="18"/>
               </w:rPr>
               <w:t>字段项不含等号</w:t>
@@ -1466,12 +2375,33 @@
         </w:tc>
         <w:tc>
           <w:tcPr>
-            <w:tcW w:type="dxa" w:w="2769"/>
+            <w:tcW w:type="dxa" w:w="3298"/>
             <w:vAlign w:val="center"/>
+            <w:tcMar>
+              <w:top w:w="95" w:type="dxa"/>
+              <w:bottom w:w="95" w:type="dxa"/>
+              <w:left w:w="110" w:type="dxa"/>
+              <w:right w:w="110" w:type="dxa"/>
+            </w:tcMar>
+            <w:shd w:fill="F3F7FA"/>
+            <w:tcBorders>
+              <w:top w:val="single" w:sz="5" w:color="D6E0EA"/>
+              <w:left w:val="single" w:sz="5" w:color="D6E0EA"/>
+              <w:bottom w:val="single" w:sz="5" w:color="D6E0EA"/>
+              <w:right w:val="single" w:sz="5" w:color="D6E0EA"/>
+              <w:insideH w:val="single" w:sz="5" w:color="D6E0EA"/>
+              <w:insideV w:val="single" w:sz="5" w:color="D6E0EA"/>
+            </w:tcBorders>
           </w:tcPr>
           <w:p>
+            <w:pPr>
+              <w:spacing w:before="0" w:after="0" w:line="240" w:lineRule="auto"/>
+              <w:jc w:val="left"/>
+            </w:pPr>
             <w:r>
               <w:rPr>
+                <w:rFonts w:ascii="Aptos" w:hAnsi="Aptos" w:eastAsia="Microsoft YaHei"/>
+                <w:color w:val="243B53"/>
                 <w:sz w:val="18"/>
               </w:rPr>
               <w:t>解析报错或将该项列入错误信息</w:t>
@@ -1480,14 +2410,37 @@
         </w:tc>
       </w:tr>
       <w:tr>
+        <w:trPr>
+          <w:cantSplit/>
+        </w:trPr>
         <w:tc>
           <w:tcPr>
-            <w:tcW w:type="dxa" w:w="2769"/>
+            <w:tcW w:type="dxa" w:w="2131"/>
             <w:vAlign w:val="center"/>
+            <w:tcMar>
+              <w:top w:w="95" w:type="dxa"/>
+              <w:bottom w:w="95" w:type="dxa"/>
+              <w:left w:w="110" w:type="dxa"/>
+              <w:right w:w="110" w:type="dxa"/>
+            </w:tcMar>
+            <w:tcBorders>
+              <w:top w:val="single" w:sz="5" w:color="D6E0EA"/>
+              <w:left w:val="single" w:sz="5" w:color="D6E0EA"/>
+              <w:bottom w:val="single" w:sz="5" w:color="D6E0EA"/>
+              <w:right w:val="single" w:sz="5" w:color="D6E0EA"/>
+              <w:insideH w:val="single" w:sz="5" w:color="D6E0EA"/>
+              <w:insideV w:val="single" w:sz="5" w:color="D6E0EA"/>
+            </w:tcBorders>
           </w:tcPr>
           <w:p>
+            <w:pPr>
+              <w:spacing w:before="0" w:after="0" w:line="240" w:lineRule="auto"/>
+              <w:jc w:val="left"/>
+            </w:pPr>
             <w:r>
               <w:rPr>
+                <w:rFonts w:ascii="Aptos" w:hAnsi="Aptos" w:eastAsia="Microsoft YaHei"/>
+                <w:color w:val="243B53"/>
                 <w:sz w:val="18"/>
               </w:rPr>
               <w:t>CP含标准监测项</w:t>
@@ -1496,12 +2449,32 @@
         </w:tc>
         <w:tc>
           <w:tcPr>
-            <w:tcW w:type="dxa" w:w="2769"/>
+            <w:tcW w:type="dxa" w:w="2880"/>
             <w:vAlign w:val="center"/>
+            <w:tcMar>
+              <w:top w:w="95" w:type="dxa"/>
+              <w:bottom w:w="95" w:type="dxa"/>
+              <w:left w:w="110" w:type="dxa"/>
+              <w:right w:w="110" w:type="dxa"/>
+            </w:tcMar>
+            <w:tcBorders>
+              <w:top w:val="single" w:sz="5" w:color="D6E0EA"/>
+              <w:left w:val="single" w:sz="5" w:color="D6E0EA"/>
+              <w:bottom w:val="single" w:sz="5" w:color="D6E0EA"/>
+              <w:right w:val="single" w:sz="5" w:color="D6E0EA"/>
+              <w:insideH w:val="single" w:sz="5" w:color="D6E0EA"/>
+              <w:insideV w:val="single" w:sz="5" w:color="D6E0EA"/>
+            </w:tcBorders>
           </w:tcPr>
           <w:p>
+            <w:pPr>
+              <w:spacing w:before="0" w:after="0" w:line="240" w:lineRule="auto"/>
+              <w:jc w:val="left"/>
+            </w:pPr>
             <w:r>
               <w:rPr>
+                <w:rFonts w:ascii="Aptos" w:hAnsi="Aptos" w:eastAsia="Microsoft YaHei"/>
+                <w:color w:val="243B53"/>
                 <w:sz w:val="18"/>
               </w:rPr>
               <w:t>含w01001-Avg与w01018-Avg</w:t>
@@ -1510,12 +2483,32 @@
         </w:tc>
         <w:tc>
           <w:tcPr>
-            <w:tcW w:type="dxa" w:w="2769"/>
+            <w:tcW w:type="dxa" w:w="3298"/>
             <w:vAlign w:val="center"/>
+            <w:tcMar>
+              <w:top w:w="95" w:type="dxa"/>
+              <w:bottom w:w="95" w:type="dxa"/>
+              <w:left w:w="110" w:type="dxa"/>
+              <w:right w:w="110" w:type="dxa"/>
+            </w:tcMar>
+            <w:tcBorders>
+              <w:top w:val="single" w:sz="5" w:color="D6E0EA"/>
+              <w:left w:val="single" w:sz="5" w:color="D6E0EA"/>
+              <w:bottom w:val="single" w:sz="5" w:color="D6E0EA"/>
+              <w:right w:val="single" w:sz="5" w:color="D6E0EA"/>
+              <w:insideH w:val="single" w:sz="5" w:color="D6E0EA"/>
+              <w:insideV w:val="single" w:sz="5" w:color="D6E0EA"/>
+            </w:tcBorders>
           </w:tcPr>
           <w:p>
+            <w:pPr>
+              <w:spacing w:before="0" w:after="0" w:line="240" w:lineRule="auto"/>
+              <w:jc w:val="left"/>
+            </w:pPr>
             <w:r>
               <w:rPr>
+                <w:rFonts w:ascii="Aptos" w:hAnsi="Aptos" w:eastAsia="Microsoft YaHei"/>
+                <w:color w:val="243B53"/>
                 <w:sz w:val="18"/>
               </w:rPr>
               <w:t>提取(w01001, Avg, 7.5)等结构化监测项</w:t>
@@ -1527,8 +2520,18 @@
     <w:p>
       <w:pPr>
         <w:pStyle w:val="3"/>
-      </w:pPr>
-      <w:r>
+        <w:keepNext/>
+        <w:spacing w:before="140" w:after="40"/>
+        <w:ind w:left="0" w:right="0" w:firstLine="0"/>
+        <w:jc w:val="left"/>
+      </w:pPr>
+      <w:r>
+        <w:rPr>
+          <w:rFonts w:ascii="Aptos" w:hAnsi="Aptos" w:eastAsia="Microsoft YaHei"/>
+          <w:b/>
+          <w:color w:val="2C5F7C"/>
+          <w:sz w:val="23"/>
+        </w:rPr>
         <w:t>5. 复杂度与边界</w:t>
       </w:r>
     </w:p>
@@ -1537,10 +2540,6 @@
         <w:keepNext w:val="0"/>
         <w:keepLines w:val="0"/>
         <w:widowControl/>
-        <w:numPr>
-          <w:ilvl w:val="0"/>
-          <w:numId w:val="0"/>
-        </w:numPr>
         <w:suppressLineNumbers w:val="0"/>
         <w:pBdr>
           <w:top w:val="none" w:color="auto" w:sz="0" w:space="0"/>
@@ -1548,8 +2547,8 @@
           <w:bottom w:val="none" w:color="auto" w:sz="0" w:space="0"/>
           <w:right w:val="none" w:color="auto" w:sz="0" w:space="0"/>
         </w:pBdr>
-        <w:spacing w:before="0" w:beforeAutospacing="0" w:after="210" w:afterAutospacing="0"/>
-        <w:ind w:left="-360" w:leftChars="0" w:right="0" w:rightChars="0"/>
+        <w:spacing w:before="0" w:beforeAutospacing="0" w:after="60" w:afterAutospacing="0" w:line="259" w:lineRule="auto"/>
+        <w:ind w:left="0" w:leftChars="0" w:right="0" w:rightChars="0" w:firstLine="0"/>
         <w:jc w:val="left"/>
         <w:rPr>
           <w:rFonts w:hint="default" w:ascii="Helvetica" w:hAnsi="Helvetica" w:eastAsia="Helvetica" w:cs="Helvetica"/>
@@ -1563,14 +2562,28 @@
         </w:rPr>
       </w:pPr>
       <w:r>
+        <w:rPr>
+          <w:rFonts w:ascii="Aptos" w:hAnsi="Aptos" w:eastAsia="Microsoft YaHei"/>
+          <w:sz w:val="21"/>
+        </w:rPr>
         <w:t>设数据段长度为 n，帧结构校验和字段解析均为 O(n)；CRC 每个字节固定执行 8 轮，时间复杂度仍为 O(n)，额外空间为 O(k)，k 为解析后字段数量。单帧解析不等同于完整 TCP 流拆包；生产场景还需处理粘包、拆包、超长输入、非 ASCII 字节、重复字段策略以及连接缓冲区。</w:t>
       </w:r>
     </w:p>
     <w:p>
       <w:pPr>
         <w:pStyle w:val="3"/>
-      </w:pPr>
-      <w:r>
+        <w:keepNext/>
+        <w:spacing w:before="140" w:after="40"/>
+        <w:ind w:left="0" w:right="0" w:firstLine="0"/>
+        <w:jc w:val="left"/>
+      </w:pPr>
+      <w:r>
+        <w:rPr>
+          <w:rFonts w:ascii="Aptos" w:hAnsi="Aptos" w:eastAsia="Microsoft YaHei"/>
+          <w:b/>
+          <w:color w:val="2C5F7C"/>
+          <w:sz w:val="23"/>
+        </w:rPr>
         <w:t>6. 实际验证记录</w:t>
       </w:r>
     </w:p>
@@ -1579,10 +2592,6 @@
         <w:keepNext w:val="0"/>
         <w:keepLines w:val="0"/>
         <w:widowControl/>
-        <w:numPr>
-          <w:ilvl w:val="0"/>
-          <w:numId w:val="0"/>
-        </w:numPr>
         <w:suppressLineNumbers w:val="0"/>
         <w:pBdr>
           <w:top w:val="none" w:color="auto" w:sz="0" w:space="0"/>
@@ -1590,8 +2599,8 @@
           <w:bottom w:val="none" w:color="auto" w:sz="0" w:space="0"/>
           <w:right w:val="none" w:color="auto" w:sz="0" w:space="0"/>
         </w:pBdr>
-        <w:spacing w:before="0" w:beforeAutospacing="0" w:after="210" w:afterAutospacing="0"/>
-        <w:ind w:left="-360" w:leftChars="0" w:right="0" w:rightChars="0"/>
+        <w:spacing w:before="0" w:beforeAutospacing="0" w:after="60" w:afterAutospacing="0" w:line="259" w:lineRule="auto"/>
+        <w:ind w:left="0" w:leftChars="0" w:right="0" w:rightChars="0" w:firstLine="0"/>
         <w:jc w:val="left"/>
         <w:rPr>
           <w:rFonts w:hint="default" w:ascii="Helvetica" w:hAnsi="Helvetica" w:eastAsia="Helvetica" w:cs="Helvetica"/>
@@ -1605,14 +2614,28 @@
         </w:rPr>
       </w:pPr>
       <w:r>
+        <w:rPr>
+          <w:rFonts w:ascii="Aptos" w:hAnsi="Aptos" w:eastAsia="Microsoft YaHei"/>
+          <w:sz w:val="21"/>
+        </w:rPr>
         <w:t>在 Python 3.14.3 环境执行 python -m unittest -v，11 项自动化回归用例全部通过。用例包含 HJ212-2017 附录 A 官方 CRC 向量（计算值 1C80）、标准完整帧、头部/长度/结束符/CRC/十六进制字段异常、CP 监测项解析、非法与重复键、非 ASCII 和超长输入，以及 CRC 错误时拒绝解析。另以示例报文确认提取到 w01001 的 Avg=7.5、Min=7.1 和 w01018 的 Avg=40.1。</w:t>
       </w:r>
     </w:p>
     <w:p>
       <w:pPr>
         <w:pStyle w:val="3"/>
-      </w:pPr>
-      <w:r>
+        <w:keepNext/>
+        <w:spacing w:before="140" w:after="40"/>
+        <w:ind w:left="0" w:right="0" w:firstLine="0"/>
+        <w:jc w:val="left"/>
+      </w:pPr>
+      <w:r>
+        <w:rPr>
+          <w:rFonts w:ascii="Aptos" w:hAnsi="Aptos" w:eastAsia="Microsoft YaHei"/>
+          <w:b/>
+          <w:color w:val="2C5F7C"/>
+          <w:sz w:val="23"/>
+        </w:rPr>
         <w:t>（三）阅读任正非公开信后的体会</w:t>
       </w:r>
     </w:p>
@@ -1621,10 +2644,6 @@
         <w:keepNext w:val="0"/>
         <w:keepLines w:val="0"/>
         <w:widowControl/>
-        <w:numPr>
-          <w:ilvl w:val="0"/>
-          <w:numId w:val="0"/>
-        </w:numPr>
         <w:suppressLineNumbers w:val="0"/>
         <w:pBdr>
           <w:top w:val="none" w:color="auto" w:sz="0" w:space="0"/>
@@ -1632,8 +2651,8 @@
           <w:bottom w:val="none" w:color="auto" w:sz="0" w:space="0"/>
           <w:right w:val="none" w:color="auto" w:sz="0" w:space="0"/>
         </w:pBdr>
-        <w:spacing w:before="0" w:beforeAutospacing="0" w:after="210" w:afterAutospacing="0"/>
-        <w:ind w:left="-360" w:leftChars="0" w:right="0" w:rightChars="0"/>
+        <w:spacing w:before="0" w:beforeAutospacing="0" w:after="60" w:afterAutospacing="0" w:line="259" w:lineRule="auto"/>
+        <w:ind w:left="0" w:leftChars="0" w:right="0" w:rightChars="0" w:firstLine="0"/>
         <w:jc w:val="left"/>
         <w:rPr>
           <w:rFonts w:hint="default" w:ascii="Helvetica" w:hAnsi="Helvetica" w:eastAsia="Helvetica" w:cs="Helvetica"/>
@@ -1647,6 +2666,10 @@
         </w:rPr>
       </w:pPr>
       <w:r>
+        <w:rPr>
+          <w:rFonts w:ascii="Aptos" w:hAnsi="Aptos" w:eastAsia="Microsoft YaHei"/>
+          <w:sz w:val="21"/>
+        </w:rPr>
         <w:t>公开信把“可信”放在功能、特性和进度之前，强调产品质量不仅是交付后的表现，也取决于开发过程是否可验证。我理解这要求工程师不能把“能运行”当作完成：需求边界要明确，设计要能解释，代码要易读、健壮，变更应可追溯，验证结果要能复现。</w:t>
       </w:r>
     </w:p>
@@ -1655,10 +2678,6 @@
         <w:keepNext w:val="0"/>
         <w:keepLines w:val="0"/>
         <w:widowControl/>
-        <w:numPr>
-          <w:ilvl w:val="0"/>
-          <w:numId w:val="0"/>
-        </w:numPr>
         <w:suppressLineNumbers w:val="0"/>
         <w:pBdr>
           <w:top w:val="none" w:color="auto" w:sz="0" w:space="0"/>
@@ -1666,8 +2685,8 @@
           <w:bottom w:val="none" w:color="auto" w:sz="0" w:space="0"/>
           <w:right w:val="none" w:color="auto" w:sz="0" w:space="0"/>
         </w:pBdr>
-        <w:spacing w:before="0" w:beforeAutospacing="0" w:after="210" w:afterAutospacing="0"/>
-        <w:ind w:left="-360" w:leftChars="0" w:right="0" w:rightChars="0"/>
+        <w:spacing w:before="0" w:beforeAutospacing="0" w:after="60" w:afterAutospacing="0" w:line="259" w:lineRule="auto"/>
+        <w:ind w:left="0" w:leftChars="0" w:right="0" w:rightChars="0" w:firstLine="0"/>
         <w:jc w:val="left"/>
         <w:rPr>
           <w:rFonts w:hint="default" w:ascii="Helvetica" w:hAnsi="Helvetica" w:eastAsia="Helvetica" w:cs="Helvetica"/>
@@ -1681,6 +2700,10 @@
         </w:rPr>
       </w:pPr>
       <w:r>
+        <w:rPr>
+          <w:rFonts w:ascii="Aptos" w:hAnsi="Aptos" w:eastAsia="Microsoft YaHei"/>
+          <w:sz w:val="21"/>
+        </w:rPr>
         <w:t>这与本次报文解析练习直接相关。若只按正常样例切字符串，长度被篡改、CRC 不匹配或 CP 字段缺失时就可能产生错误数据。先校验帧边界和 CRC，再解析字段，是把质量要求落实到代码顺序中的一个小例子。明确错误行为、保留原始字段、对异常输入给出可诊断结果，也能让后续维护者更容易判断问题。</w:t>
       </w:r>
     </w:p>
@@ -1689,10 +2712,6 @@
         <w:keepNext w:val="0"/>
         <w:keepLines w:val="0"/>
         <w:widowControl/>
-        <w:numPr>
-          <w:ilvl w:val="0"/>
-          <w:numId w:val="0"/>
-        </w:numPr>
         <w:suppressLineNumbers w:val="0"/>
         <w:pBdr>
           <w:top w:val="none" w:color="auto" w:sz="0" w:space="0"/>
@@ -1700,8 +2719,8 @@
           <w:bottom w:val="none" w:color="auto" w:sz="0" w:space="0"/>
           <w:right w:val="none" w:color="auto" w:sz="0" w:space="0"/>
         </w:pBdr>
-        <w:spacing w:before="0" w:beforeAutospacing="0" w:after="210" w:afterAutospacing="0"/>
-        <w:ind w:left="-360" w:leftChars="0" w:right="0" w:rightChars="0"/>
+        <w:spacing w:before="0" w:beforeAutospacing="0" w:after="60" w:afterAutospacing="0" w:line="259" w:lineRule="auto"/>
+        <w:ind w:left="0" w:leftChars="0" w:right="0" w:rightChars="0" w:firstLine="0"/>
         <w:jc w:val="left"/>
         <w:rPr>
           <w:rFonts w:hint="default" w:ascii="Helvetica" w:hAnsi="Helvetica" w:eastAsia="Helvetica" w:cs="Helvetica"/>
@@ -1715,14 +2734,28 @@
         </w:rPr>
       </w:pPr>
       <w:r>
+        <w:rPr>
+          <w:rFonts w:ascii="Aptos" w:hAnsi="Aptos" w:eastAsia="Microsoft YaHei"/>
+          <w:sz w:val="21"/>
+        </w:rPr>
         <w:t>信中关于从基础编码质量做起的观点提醒我，简洁并不意味着省略校验；好的实现应让规则清楚、边界清楚、结果可检查。Git 提交记录则把代码演进留下证据，使修改原因和影响可以回看。今后写课程项目时，我会把测试、代码评审和提交说明作为开发过程的一部分，而不是最后补文档。</w:t>
       </w:r>
     </w:p>
     <w:p>
       <w:pPr>
         <w:pStyle w:val="3"/>
-      </w:pPr>
-      <w:r>
+        <w:keepNext/>
+        <w:spacing w:before="200" w:after="80"/>
+        <w:ind w:left="0" w:right="0" w:firstLine="0"/>
+        <w:jc w:val="left"/>
+      </w:pPr>
+      <w:r>
+        <w:rPr>
+          <w:rFonts w:ascii="Aptos" w:hAnsi="Aptos" w:eastAsia="Microsoft YaHei"/>
+          <w:b/>
+          <w:color w:val="17365D"/>
+          <w:sz w:val="28"/>
+        </w:rPr>
         <w:t>五、实验结论</w:t>
       </w:r>
     </w:p>
@@ -1731,10 +2764,6 @@
         <w:keepNext w:val="0"/>
         <w:keepLines w:val="0"/>
         <w:widowControl/>
-        <w:numPr>
-          <w:ilvl w:val="0"/>
-          <w:numId w:val="0"/>
-        </w:numPr>
         <w:suppressLineNumbers w:val="0"/>
         <w:pBdr>
           <w:top w:val="none" w:color="auto" w:sz="0" w:space="0"/>
@@ -1742,8 +2771,8 @@
           <w:bottom w:val="none" w:color="auto" w:sz="0" w:space="0"/>
           <w:right w:val="none" w:color="auto" w:sz="0" w:space="0"/>
         </w:pBdr>
-        <w:spacing w:before="0" w:beforeAutospacing="0" w:after="210" w:afterAutospacing="0"/>
-        <w:ind w:left="-360" w:leftChars="0" w:right="0" w:rightChars="0"/>
+        <w:spacing w:before="0" w:beforeAutospacing="0" w:after="60" w:afterAutospacing="0" w:line="259" w:lineRule="auto"/>
+        <w:ind w:left="0" w:leftChars="0" w:right="0" w:rightChars="0" w:firstLine="0"/>
         <w:jc w:val="left"/>
         <w:rPr>
           <w:rFonts w:hint="default" w:ascii="Helvetica" w:hAnsi="Helvetica" w:eastAsia="Helvetica" w:cs="Helvetica"/>
@@ -1757,6 +2786,10 @@
         </w:rPr>
       </w:pPr>
       <w:r>
+        <w:rPr>
+          <w:rFonts w:ascii="Aptos" w:hAnsi="Aptos" w:eastAsia="Microsoft YaHei"/>
+          <w:sz w:val="21"/>
+        </w:rPr>
         <w:t>本实验围绕 Git 基本操作、HJ212-2017 单帧报文解析和软件工程质量意识展开。通过把解析流程拆分为帧校验、CRC 计算、数据段解析和监测数据提取，可以降低各步骤之间的耦合，并让错误更容易定位。检查用例覆盖长度、CRC、结束符和数据字段等主要边界，可作为后续回归检查的依据。</w:t>
       </w:r>
     </w:p>
@@ -1765,10 +2798,6 @@
         <w:keepNext w:val="0"/>
         <w:keepLines w:val="0"/>
         <w:widowControl/>
-        <w:numPr>
-          <w:ilvl w:val="0"/>
-          <w:numId w:val="0"/>
-        </w:numPr>
         <w:suppressLineNumbers w:val="0"/>
         <w:pBdr>
           <w:top w:val="none" w:color="auto" w:sz="0" w:space="0"/>
@@ -1776,8 +2805,8 @@
           <w:bottom w:val="none" w:color="auto" w:sz="0" w:space="0"/>
           <w:right w:val="none" w:color="auto" w:sz="0" w:space="0"/>
         </w:pBdr>
-        <w:spacing w:before="0" w:beforeAutospacing="0" w:after="210" w:afterAutospacing="0"/>
-        <w:ind w:left="-360" w:leftChars="0" w:right="0" w:rightChars="0"/>
+        <w:spacing w:before="0" w:beforeAutospacing="0" w:after="60" w:afterAutospacing="0" w:line="259" w:lineRule="auto"/>
+        <w:ind w:left="0" w:leftChars="0" w:right="0" w:rightChars="0" w:firstLine="0"/>
         <w:jc w:val="left"/>
         <w:rPr>
           <w:rFonts w:hint="default" w:ascii="Helvetica" w:hAnsi="Helvetica" w:eastAsia="Helvetica" w:cs="Helvetica"/>
@@ -1791,14 +2820,28 @@
         </w:rPr>
       </w:pPr>
       <w:r>
+        <w:rPr>
+          <w:rFonts w:ascii="Aptos" w:hAnsi="Aptos" w:eastAsia="Microsoft YaHei"/>
+          <w:sz w:val="21"/>
+        </w:rPr>
         <w:t>个人总结：需要补强的不只是算法实现，还包括将协议规则转换为明确的输入约束、记录可复现的验证过程，以及保持提交历史清晰。本次实现将协议边界、CRC 校验和字段解析分层处理，并通过 11 项回归用例验证主要路径和异常输入。</w:t>
       </w:r>
     </w:p>
     <w:p>
       <w:pPr>
         <w:pStyle w:val="3"/>
-      </w:pPr>
-      <w:r>
+        <w:keepNext/>
+        <w:spacing w:before="200" w:after="80"/>
+        <w:ind w:left="0" w:right="0" w:firstLine="0"/>
+        <w:jc w:val="left"/>
+      </w:pPr>
+      <w:r>
+        <w:rPr>
+          <w:rFonts w:ascii="Aptos" w:hAnsi="Aptos" w:eastAsia="Microsoft YaHei"/>
+          <w:b/>
+          <w:color w:val="17365D"/>
+          <w:sz w:val="28"/>
+        </w:rPr>
         <w:t>六、仓库地址</w:t>
       </w:r>
     </w:p>
@@ -1807,10 +2850,6 @@
         <w:keepNext w:val="0"/>
         <w:keepLines w:val="0"/>
         <w:widowControl/>
-        <w:numPr>
-          <w:ilvl w:val="0"/>
-          <w:numId w:val="0"/>
-        </w:numPr>
         <w:suppressLineNumbers w:val="0"/>
         <w:pBdr>
           <w:top w:val="none" w:color="auto" w:sz="0" w:space="0"/>
@@ -1818,8 +2857,8 @@
           <w:bottom w:val="none" w:color="auto" w:sz="0" w:space="0"/>
           <w:right w:val="none" w:color="auto" w:sz="0" w:space="0"/>
         </w:pBdr>
-        <w:spacing w:before="0" w:beforeAutospacing="0" w:after="210" w:afterAutospacing="0"/>
-        <w:ind w:left="-360" w:leftChars="0" w:right="0" w:rightChars="0"/>
+        <w:spacing w:before="0" w:beforeAutospacing="0" w:after="60" w:afterAutospacing="0" w:line="259" w:lineRule="auto"/>
+        <w:ind w:left="0" w:leftChars="0" w:right="0" w:rightChars="0" w:firstLine="0"/>
         <w:jc w:val="left"/>
         <w:rPr>
           <w:rFonts w:hint="default" w:ascii="Helvetica" w:hAnsi="Helvetica" w:eastAsia="Helvetica" w:cs="Helvetica"/>
@@ -1833,14 +2872,28 @@
         </w:rPr>
       </w:pPr>
       <w:r>
+        <w:rPr>
+          <w:rFonts w:ascii="Aptos" w:hAnsi="Aptos" w:eastAsia="Microsoft YaHei"/>
+          <w:sz w:val="21"/>
+        </w:rPr>
         <w:t>GitHub 公开仓库地址：https://github.com/qianrui1006/202380010733-software-engineering-lab1</w:t>
       </w:r>
     </w:p>
     <w:p>
       <w:pPr>
         <w:pStyle w:val="3"/>
-      </w:pPr>
-      <w:r>
+        <w:keepNext/>
+        <w:spacing w:before="200" w:after="80"/>
+        <w:ind w:left="0" w:right="0" w:firstLine="0"/>
+        <w:jc w:val="left"/>
+      </w:pPr>
+      <w:r>
+        <w:rPr>
+          <w:rFonts w:ascii="Aptos" w:hAnsi="Aptos" w:eastAsia="Microsoft YaHei"/>
+          <w:b/>
+          <w:color w:val="17365D"/>
+          <w:sz w:val="28"/>
+        </w:rPr>
         <w:t>参考资料</w:t>
       </w:r>
     </w:p>
@@ -1849,10 +2902,6 @@
         <w:keepNext w:val="0"/>
         <w:keepLines w:val="0"/>
         <w:widowControl/>
-        <w:numPr>
-          <w:ilvl w:val="0"/>
-          <w:numId w:val="0"/>
-        </w:numPr>
         <w:suppressLineNumbers w:val="0"/>
         <w:pBdr>
           <w:top w:val="none" w:color="auto" w:sz="0" w:space="0"/>
@@ -1860,8 +2909,8 @@
           <w:bottom w:val="none" w:color="auto" w:sz="0" w:space="0"/>
           <w:right w:val="none" w:color="auto" w:sz="0" w:space="0"/>
         </w:pBdr>
-        <w:spacing w:before="0" w:beforeAutospacing="0" w:after="210" w:afterAutospacing="0"/>
-        <w:ind w:left="-360" w:leftChars="0" w:right="0" w:rightChars="0"/>
+        <w:spacing w:before="0" w:beforeAutospacing="0" w:after="30" w:afterAutospacing="0" w:line="240" w:lineRule="auto"/>
+        <w:ind w:left="259" w:leftChars="0" w:right="0" w:rightChars="0" w:hanging="259"/>
         <w:jc w:val="left"/>
         <w:rPr>
           <w:rFonts w:hint="default" w:ascii="Helvetica" w:hAnsi="Helvetica" w:eastAsia="Helvetica" w:cs="Helvetica"/>
@@ -1875,6 +2924,10 @@
         </w:rPr>
       </w:pPr>
       <w:r>
+        <w:rPr>
+          <w:rFonts w:ascii="Aptos" w:hAnsi="Aptos" w:eastAsia="Microsoft YaHei"/>
+          <w:sz w:val="19"/>
+        </w:rPr>
         <w:t>[1] 星语课程网：《软件工程实验一：个人编程技能和git操作》，https://star.jmhui.com.cn/p1/366.html</w:t>
       </w:r>
     </w:p>
@@ -1883,10 +2936,6 @@
         <w:keepNext w:val="0"/>
         <w:keepLines w:val="0"/>
         <w:widowControl/>
-        <w:numPr>
-          <w:ilvl w:val="0"/>
-          <w:numId w:val="0"/>
-        </w:numPr>
         <w:suppressLineNumbers w:val="0"/>
         <w:pBdr>
           <w:top w:val="none" w:color="auto" w:sz="0" w:space="0"/>
@@ -1894,8 +2943,8 @@
           <w:bottom w:val="none" w:color="auto" w:sz="0" w:space="0"/>
           <w:right w:val="none" w:color="auto" w:sz="0" w:space="0"/>
         </w:pBdr>
-        <w:spacing w:before="0" w:beforeAutospacing="0" w:after="210" w:afterAutospacing="0"/>
-        <w:ind w:left="-360" w:leftChars="0" w:right="0" w:rightChars="0"/>
+        <w:spacing w:before="0" w:beforeAutospacing="0" w:after="30" w:afterAutospacing="0" w:line="240" w:lineRule="auto"/>
+        <w:ind w:left="259" w:leftChars="0" w:right="0" w:rightChars="0" w:hanging="259"/>
         <w:jc w:val="left"/>
         <w:rPr>
           <w:rFonts w:hint="default" w:ascii="Helvetica" w:hAnsi="Helvetica" w:eastAsia="Helvetica" w:cs="Helvetica"/>
@@ -1909,6 +2958,10 @@
         </w:rPr>
       </w:pPr>
       <w:r>
+        <w:rPr>
+          <w:rFonts w:ascii="Aptos" w:hAnsi="Aptos" w:eastAsia="Microsoft YaHei"/>
+          <w:sz w:val="19"/>
+        </w:rPr>
         <w:t>[2] 星语课程网：《实验报告模板》，https://star.jmhui.com.cn/u/cms/www/202203/06163639qy7y.docx</w:t>
       </w:r>
     </w:p>
@@ -1917,10 +2970,6 @@
         <w:keepNext w:val="0"/>
         <w:keepLines w:val="0"/>
         <w:widowControl/>
-        <w:numPr>
-          <w:ilvl w:val="0"/>
-          <w:numId w:val="0"/>
-        </w:numPr>
         <w:suppressLineNumbers w:val="0"/>
         <w:pBdr>
           <w:top w:val="none" w:color="auto" w:sz="0" w:space="0"/>
@@ -1928,8 +2977,8 @@
           <w:bottom w:val="none" w:color="auto" w:sz="0" w:space="0"/>
           <w:right w:val="none" w:color="auto" w:sz="0" w:space="0"/>
         </w:pBdr>
-        <w:spacing w:before="0" w:beforeAutospacing="0" w:after="210" w:afterAutospacing="0"/>
-        <w:ind w:left="-360" w:leftChars="0" w:right="0" w:rightChars="0"/>
+        <w:spacing w:before="0" w:beforeAutospacing="0" w:after="30" w:afterAutospacing="0" w:line="240" w:lineRule="auto"/>
+        <w:ind w:left="259" w:leftChars="0" w:right="0" w:rightChars="0" w:hanging="259"/>
         <w:jc w:val="left"/>
         <w:rPr>
           <w:rFonts w:hint="default" w:ascii="Helvetica" w:hAnsi="Helvetica" w:eastAsia="Helvetica" w:cs="Helvetica"/>
@@ -1943,6 +2992,10 @@
         </w:rPr>
       </w:pPr>
       <w:r>
+        <w:rPr>
+          <w:rFonts w:ascii="Aptos" w:hAnsi="Aptos" w:eastAsia="Microsoft YaHei"/>
+          <w:sz w:val="19"/>
+        </w:rPr>
         <w:t>[3] 环境保护部：《污染物在线监控（监测）系统数据传输标准》（HJ 212-2017），通讯结构见6.3节，CRC算法见附录A，https://big5.mee.gov.cn/gate/big5/www.mee.gov.cn/ywgz/fgbz/bz/bzwb/other/qt/201706/W020220223593176860729.pdf</w:t>
       </w:r>
     </w:p>
@@ -1951,10 +3004,6 @@
         <w:keepNext w:val="0"/>
         <w:keepLines w:val="0"/>
         <w:widowControl/>
-        <w:numPr>
-          <w:ilvl w:val="0"/>
-          <w:numId w:val="0"/>
-        </w:numPr>
         <w:suppressLineNumbers w:val="0"/>
         <w:pBdr>
           <w:top w:val="none" w:color="auto" w:sz="0" w:space="0"/>
@@ -1962,8 +3011,8 @@
           <w:bottom w:val="none" w:color="auto" w:sz="0" w:space="0"/>
           <w:right w:val="none" w:color="auto" w:sz="0" w:space="0"/>
         </w:pBdr>
-        <w:spacing w:before="0" w:beforeAutospacing="0" w:after="210" w:afterAutospacing="0"/>
-        <w:ind w:left="-360" w:leftChars="0" w:right="0" w:rightChars="0"/>
+        <w:spacing w:before="0" w:beforeAutospacing="0" w:after="30" w:afterAutospacing="0" w:line="240" w:lineRule="auto"/>
+        <w:ind w:left="259" w:leftChars="0" w:right="0" w:rightChars="0" w:hanging="259"/>
         <w:jc w:val="left"/>
         <w:rPr>
           <w:rFonts w:hint="default" w:ascii="Helvetica" w:hAnsi="Helvetica" w:eastAsia="Helvetica" w:cs="Helvetica"/>
@@ -1977,6 +3026,10 @@
         </w:rPr>
       </w:pPr>
       <w:r>
+        <w:rPr>
+          <w:rFonts w:ascii="Aptos" w:hAnsi="Aptos" w:eastAsia="Microsoft YaHei"/>
+          <w:sz w:val="19"/>
+        </w:rPr>
         <w:t>[4] 任正非：《全面提升软件工程能力与实践，打造可信的高质量产品》，华为公开信，2019。</w:t>
       </w:r>
     </w:p>

</xml_diff>

<commit_message>
docs: add execution screenshots to appendix
</commit_message>
<xml_diff>
--- a/docs/202380010733-钱锐-软件工程实验一.docx
+++ b/docs/202380010733-钱锐-软件工程实验一.docx
@@ -4113,6 +4113,365 @@
         <w:t>[4] 任正非：《全面提升软件工程能力与实践，打造可信的高质量产品》，华为公开信，2019年。</w:t>
       </w:r>
     </w:p>
+    <w:p>
+      <w:pPr>
+        <w:pStyle w:val="3"/>
+        <w:keepNext/>
+        <w:pageBreakBefore/>
+        <w:spacing w:before="100" w:after="30"/>
+        <w:ind w:left="0" w:right="0" w:firstLine="0"/>
+        <w:jc w:val="left"/>
+      </w:pPr>
+      <w:r>
+        <w:rPr>
+          <w:rFonts w:ascii="Aptos" w:hAnsi="Aptos" w:eastAsia="Microsoft YaHei"/>
+          <w:b/>
+          <w:color w:val="2C5F7C"/>
+          <w:sz w:val="23"/>
+        </w:rPr>
+        <w:t>七、附录</w:t>
+      </w:r>
+    </w:p>
+    <w:p>
+      <w:pPr>
+        <w:keepNext w:val="0"/>
+        <w:keepLines w:val="0"/>
+        <w:widowControl/>
+        <w:suppressLineNumbers w:val="0"/>
+        <w:pBdr>
+          <w:top w:val="none" w:color="auto" w:sz="0" w:space="0"/>
+          <w:left w:val="none" w:color="auto" w:sz="0" w:space="0"/>
+          <w:bottom w:val="none" w:color="auto" w:sz="0" w:space="0"/>
+          <w:right w:val="none" w:color="auto" w:sz="0" w:space="0"/>
+        </w:pBdr>
+        <w:spacing w:before="0" w:beforeAutospacing="0" w:after="30" w:afterAutospacing="0" w:line="247" w:lineRule="auto"/>
+        <w:ind w:left="0" w:leftChars="0" w:right="0" w:rightChars="0" w:firstLine="0"/>
+        <w:jc w:val="left"/>
+        <w:rPr>
+          <w:rFonts w:hint="default" w:ascii="Helvetica" w:hAnsi="Helvetica" w:eastAsia="Helvetica" w:cs="Helvetica"/>
+          <w:i w:val="0"/>
+          <w:caps w:val="0"/>
+          <w:color w:val="000000"/>
+          <w:spacing w:val="0"/>
+          <w:sz w:val="18"/>
+          <w:szCs w:val="18"/>
+          <w:shd w:val="clear" w:color="auto" w:fill="FFFFFF"/>
+        </w:rPr>
+      </w:pPr>
+      <w:r>
+        <w:rPr>
+          <w:rFonts w:ascii="Aptos" w:hAnsi="Aptos" w:eastAsia="Microsoft YaHei"/>
+          <w:sz w:val="21"/>
+        </w:rPr>
+        <w:t>以下为程序运行与解析验证的控制台记录。运行环境为 Python 3.14.3，图片中的命令和输出由本地实际执行生成。</w:t>
+      </w:r>
+    </w:p>
+    <w:p>
+      <w:pPr>
+        <w:keepNext w:val="0"/>
+        <w:keepLines w:val="0"/>
+        <w:widowControl/>
+        <w:suppressLineNumbers w:val="0"/>
+        <w:pBdr>
+          <w:top w:val="none" w:color="auto" w:sz="0" w:space="0"/>
+          <w:left w:val="none" w:color="auto" w:sz="0" w:space="0"/>
+          <w:bottom w:val="none" w:color="auto" w:sz="0" w:space="0"/>
+          <w:right w:val="none" w:color="auto" w:sz="0" w:space="0"/>
+        </w:pBdr>
+        <w:spacing w:before="40" w:beforeAutospacing="0" w:after="20" w:afterAutospacing="0" w:line="247" w:lineRule="auto"/>
+        <w:ind w:left="0" w:leftChars="0" w:right="0" w:rightChars="0" w:firstLine="0"/>
+        <w:jc w:val="center"/>
+        <w:rPr>
+          <w:rFonts w:hint="default" w:ascii="Helvetica" w:hAnsi="Helvetica" w:eastAsia="Helvetica" w:cs="Helvetica"/>
+          <w:i w:val="0"/>
+          <w:caps w:val="0"/>
+          <w:color w:val="000000"/>
+          <w:spacing w:val="0"/>
+          <w:sz w:val="18"/>
+          <w:szCs w:val="18"/>
+          <w:shd w:val="clear" w:color="auto" w:fill="FFFFFF"/>
+        </w:rPr>
+      </w:pPr>
+      <w:r>
+        <w:rPr>
+          <w:rFonts w:ascii="Aptos" w:hAnsi="Aptos" w:eastAsia="Microsoft YaHei"/>
+          <w:sz w:val="21"/>
+        </w:rPr>
+      </w:r>
+      <w:r>
+        <w:drawing>
+          <wp:inline xmlns:a="http://schemas.openxmlformats.org/drawingml/2006/main" xmlns:pic="http://schemas.openxmlformats.org/drawingml/2006/picture">
+            <wp:extent cx="5486400" cy="610459"/>
+            <wp:docPr id="1" name="Picture 1"/>
+            <wp:cNvGraphicFramePr>
+              <a:graphicFrameLocks noChangeAspect="1"/>
+            </wp:cNvGraphicFramePr>
+            <a:graphic>
+              <a:graphicData uri="http://schemas.openxmlformats.org/drawingml/2006/picture">
+                <pic:pic>
+                  <pic:nvPicPr>
+                    <pic:cNvPr id="0" name="figure-7-1-hello-world.png"/>
+                    <pic:cNvPicPr/>
+                  </pic:nvPicPr>
+                  <pic:blipFill>
+                    <a:blip r:embed="rId7"/>
+                    <a:stretch>
+                      <a:fillRect/>
+                    </a:stretch>
+                  </pic:blipFill>
+                  <pic:spPr>
+                    <a:xfrm>
+                      <a:off x="0" y="0"/>
+                      <a:ext cx="5486400" cy="610459"/>
+                    </a:xfrm>
+                    <a:prstGeom prst="rect"/>
+                  </pic:spPr>
+                </pic:pic>
+              </a:graphicData>
+            </a:graphic>
+          </wp:inline>
+        </w:drawing>
+      </w:r>
+    </w:p>
+    <w:p>
+      <w:pPr>
+        <w:keepNext w:val="0"/>
+        <w:keepLines w:val="0"/>
+        <w:widowControl/>
+        <w:suppressLineNumbers w:val="0"/>
+        <w:pBdr>
+          <w:top w:val="none" w:color="auto" w:sz="0" w:space="0"/>
+          <w:left w:val="none" w:color="auto" w:sz="0" w:space="0"/>
+          <w:bottom w:val="none" w:color="auto" w:sz="0" w:space="0"/>
+          <w:right w:val="none" w:color="auto" w:sz="0" w:space="0"/>
+        </w:pBdr>
+        <w:spacing w:before="0" w:beforeAutospacing="0" w:after="80" w:afterAutospacing="0" w:line="247" w:lineRule="auto"/>
+        <w:ind w:left="0" w:leftChars="0" w:right="0" w:rightChars="0" w:firstLine="0"/>
+        <w:jc w:val="center"/>
+        <w:rPr>
+          <w:rFonts w:hint="default" w:ascii="Helvetica" w:hAnsi="Helvetica" w:eastAsia="Helvetica" w:cs="Helvetica"/>
+          <w:i w:val="0"/>
+          <w:caps w:val="0"/>
+          <w:color w:val="000000"/>
+          <w:spacing w:val="0"/>
+          <w:sz w:val="18"/>
+          <w:szCs w:val="18"/>
+          <w:shd w:val="clear" w:color="auto" w:fill="FFFFFF"/>
+        </w:rPr>
+      </w:pPr>
+      <w:r>
+        <w:rPr>
+          <w:rFonts w:ascii="Aptos" w:hAnsi="Aptos" w:eastAsia="Microsoft YaHei"/>
+          <w:color w:val="526579"/>
+          <w:sz w:val="18"/>
+        </w:rPr>
+        <w:t>图7-1  Hello World 程序运行结果</w:t>
+      </w:r>
+    </w:p>
+    <w:p>
+      <w:pPr>
+        <w:keepNext w:val="0"/>
+        <w:keepLines w:val="0"/>
+        <w:widowControl/>
+        <w:suppressLineNumbers w:val="0"/>
+        <w:pBdr>
+          <w:top w:val="none" w:color="auto" w:sz="0" w:space="0"/>
+          <w:left w:val="none" w:color="auto" w:sz="0" w:space="0"/>
+          <w:bottom w:val="none" w:color="auto" w:sz="0" w:space="0"/>
+          <w:right w:val="none" w:color="auto" w:sz="0" w:space="0"/>
+        </w:pBdr>
+        <w:spacing w:before="40" w:beforeAutospacing="0" w:after="20" w:afterAutospacing="0" w:line="247" w:lineRule="auto"/>
+        <w:ind w:left="0" w:leftChars="0" w:right="0" w:rightChars="0" w:firstLine="0"/>
+        <w:jc w:val="center"/>
+        <w:rPr>
+          <w:rFonts w:hint="default" w:ascii="Helvetica" w:hAnsi="Helvetica" w:eastAsia="Helvetica" w:cs="Helvetica"/>
+          <w:i w:val="0"/>
+          <w:caps w:val="0"/>
+          <w:color w:val="000000"/>
+          <w:spacing w:val="0"/>
+          <w:sz w:val="18"/>
+          <w:szCs w:val="18"/>
+          <w:shd w:val="clear" w:color="auto" w:fill="FFFFFF"/>
+        </w:rPr>
+      </w:pPr>
+      <w:r>
+        <w:rPr>
+          <w:rFonts w:ascii="Aptos" w:hAnsi="Aptos" w:eastAsia="Microsoft YaHei"/>
+          <w:sz w:val="21"/>
+        </w:rPr>
+      </w:r>
+      <w:r>
+        <w:drawing>
+          <wp:inline xmlns:a="http://schemas.openxmlformats.org/drawingml/2006/main" xmlns:pic="http://schemas.openxmlformats.org/drawingml/2006/picture">
+            <wp:extent cx="5486400" cy="1166826"/>
+            <wp:docPr id="2" name="Picture 2"/>
+            <wp:cNvGraphicFramePr>
+              <a:graphicFrameLocks noChangeAspect="1"/>
+            </wp:cNvGraphicFramePr>
+            <a:graphic>
+              <a:graphicData uri="http://schemas.openxmlformats.org/drawingml/2006/picture">
+                <pic:pic>
+                  <pic:nvPicPr>
+                    <pic:cNvPr id="0" name="figure-7-2-unit-tests.png"/>
+                    <pic:cNvPicPr/>
+                  </pic:nvPicPr>
+                  <pic:blipFill>
+                    <a:blip r:embed="rId8"/>
+                    <a:stretch>
+                      <a:fillRect/>
+                    </a:stretch>
+                  </pic:blipFill>
+                  <pic:spPr>
+                    <a:xfrm>
+                      <a:off x="0" y="0"/>
+                      <a:ext cx="5486400" cy="1166826"/>
+                    </a:xfrm>
+                    <a:prstGeom prst="rect"/>
+                  </pic:spPr>
+                </pic:pic>
+              </a:graphicData>
+            </a:graphic>
+          </wp:inline>
+        </w:drawing>
+      </w:r>
+    </w:p>
+    <w:p>
+      <w:pPr>
+        <w:keepNext w:val="0"/>
+        <w:keepLines w:val="0"/>
+        <w:widowControl/>
+        <w:suppressLineNumbers w:val="0"/>
+        <w:pBdr>
+          <w:top w:val="none" w:color="auto" w:sz="0" w:space="0"/>
+          <w:left w:val="none" w:color="auto" w:sz="0" w:space="0"/>
+          <w:bottom w:val="none" w:color="auto" w:sz="0" w:space="0"/>
+          <w:right w:val="none" w:color="auto" w:sz="0" w:space="0"/>
+        </w:pBdr>
+        <w:spacing w:before="0" w:beforeAutospacing="0" w:after="80" w:afterAutospacing="0" w:line="247" w:lineRule="auto"/>
+        <w:ind w:left="0" w:leftChars="0" w:right="0" w:rightChars="0" w:firstLine="0"/>
+        <w:jc w:val="center"/>
+        <w:rPr>
+          <w:rFonts w:hint="default" w:ascii="Helvetica" w:hAnsi="Helvetica" w:eastAsia="Helvetica" w:cs="Helvetica"/>
+          <w:i w:val="0"/>
+          <w:caps w:val="0"/>
+          <w:color w:val="000000"/>
+          <w:spacing w:val="0"/>
+          <w:sz w:val="18"/>
+          <w:szCs w:val="18"/>
+          <w:shd w:val="clear" w:color="auto" w:fill="FFFFFF"/>
+        </w:rPr>
+      </w:pPr>
+      <w:r>
+        <w:rPr>
+          <w:rFonts w:ascii="Aptos" w:hAnsi="Aptos" w:eastAsia="Microsoft YaHei"/>
+          <w:color w:val="526579"/>
+          <w:sz w:val="18"/>
+        </w:rPr>
+        <w:t>图7-2  HJ212-2017 解析器 11 项自动化测试结果</w:t>
+      </w:r>
+    </w:p>
+    <w:p>
+      <w:pPr>
+        <w:keepNext w:val="0"/>
+        <w:keepLines w:val="0"/>
+        <w:widowControl/>
+        <w:suppressLineNumbers w:val="0"/>
+        <w:pBdr>
+          <w:top w:val="none" w:color="auto" w:sz="0" w:space="0"/>
+          <w:left w:val="none" w:color="auto" w:sz="0" w:space="0"/>
+          <w:bottom w:val="none" w:color="auto" w:sz="0" w:space="0"/>
+          <w:right w:val="none" w:color="auto" w:sz="0" w:space="0"/>
+        </w:pBdr>
+        <w:spacing w:before="40" w:beforeAutospacing="0" w:after="20" w:afterAutospacing="0" w:line="247" w:lineRule="auto"/>
+        <w:ind w:left="0" w:leftChars="0" w:right="0" w:rightChars="0" w:firstLine="0"/>
+        <w:jc w:val="center"/>
+        <w:rPr>
+          <w:rFonts w:hint="default" w:ascii="Helvetica" w:hAnsi="Helvetica" w:eastAsia="Helvetica" w:cs="Helvetica"/>
+          <w:i w:val="0"/>
+          <w:caps w:val="0"/>
+          <w:color w:val="000000"/>
+          <w:spacing w:val="0"/>
+          <w:sz w:val="18"/>
+          <w:szCs w:val="18"/>
+          <w:shd w:val="clear" w:color="auto" w:fill="FFFFFF"/>
+        </w:rPr>
+      </w:pPr>
+      <w:r>
+        <w:rPr>
+          <w:rFonts w:ascii="Aptos" w:hAnsi="Aptos" w:eastAsia="Microsoft YaHei"/>
+          <w:sz w:val="21"/>
+        </w:rPr>
+      </w:r>
+      <w:r>
+        <w:drawing>
+          <wp:inline xmlns:a="http://schemas.openxmlformats.org/drawingml/2006/main" xmlns:pic="http://schemas.openxmlformats.org/drawingml/2006/picture">
+            <wp:extent cx="5486400" cy="1027734"/>
+            <wp:docPr id="3" name="Picture 3"/>
+            <wp:cNvGraphicFramePr>
+              <a:graphicFrameLocks noChangeAspect="1"/>
+            </wp:cNvGraphicFramePr>
+            <a:graphic>
+              <a:graphicData uri="http://schemas.openxmlformats.org/drawingml/2006/picture">
+                <pic:pic>
+                  <pic:nvPicPr>
+                    <pic:cNvPr id="0" name="figure-7-3-parser-output.png"/>
+                    <pic:cNvPicPr/>
+                  </pic:nvPicPr>
+                  <pic:blipFill>
+                    <a:blip r:embed="rId9"/>
+                    <a:stretch>
+                      <a:fillRect/>
+                    </a:stretch>
+                  </pic:blipFill>
+                  <pic:spPr>
+                    <a:xfrm>
+                      <a:off x="0" y="0"/>
+                      <a:ext cx="5486400" cy="1027734"/>
+                    </a:xfrm>
+                    <a:prstGeom prst="rect"/>
+                  </pic:spPr>
+                </pic:pic>
+              </a:graphicData>
+            </a:graphic>
+          </wp:inline>
+        </w:drawing>
+      </w:r>
+    </w:p>
+    <w:p>
+      <w:pPr>
+        <w:keepNext w:val="0"/>
+        <w:keepLines w:val="0"/>
+        <w:widowControl/>
+        <w:suppressLineNumbers w:val="0"/>
+        <w:pBdr>
+          <w:top w:val="none" w:color="auto" w:sz="0" w:space="0"/>
+          <w:left w:val="none" w:color="auto" w:sz="0" w:space="0"/>
+          <w:bottom w:val="none" w:color="auto" w:sz="0" w:space="0"/>
+          <w:right w:val="none" w:color="auto" w:sz="0" w:space="0"/>
+        </w:pBdr>
+        <w:spacing w:before="0" w:beforeAutospacing="0" w:after="80" w:afterAutospacing="0" w:line="247" w:lineRule="auto"/>
+        <w:ind w:left="0" w:leftChars="0" w:right="0" w:rightChars="0" w:firstLine="0"/>
+        <w:jc w:val="center"/>
+        <w:rPr>
+          <w:rFonts w:hint="default" w:ascii="Helvetica" w:hAnsi="Helvetica" w:eastAsia="Helvetica" w:cs="Helvetica"/>
+          <w:i w:val="0"/>
+          <w:caps w:val="0"/>
+          <w:color w:val="000000"/>
+          <w:spacing w:val="0"/>
+          <w:sz w:val="18"/>
+          <w:szCs w:val="18"/>
+          <w:shd w:val="clear" w:color="auto" w:fill="FFFFFF"/>
+        </w:rPr>
+      </w:pPr>
+      <w:r>
+        <w:rPr>
+          <w:rFonts w:ascii="Aptos" w:hAnsi="Aptos" w:eastAsia="Microsoft YaHei"/>
+          <w:color w:val="526579"/>
+          <w:sz w:val="18"/>
+        </w:rPr>
+        <w:t>图7-3  完整报文校验与监测因子提取结果</w:t>
+      </w:r>
+    </w:p>
     <w:sectPr>
       <w:pgSz w:w="11906" w:h="16838"/>
       <w:pgMar w:top="1440" w:right="1800" w:bottom="1440" w:left="1800" w:header="851" w:footer="992" w:gutter="0"/>

</xml_diff>